<commit_message>
2.0 version of part 1a
</commit_message>
<xml_diff>
--- a/docs/part 1/part 1a.docx
+++ b/docs/part 1/part 1a.docx
@@ -9,8 +9,165 @@
           <w:rFonts w:hint="default"/>
           <w:b/>
           <w:bCs/>
+          <w:sz w:val="44"/>
+          <w:szCs w:val="44"/>
+        </w:rPr>
+      </w:pPr>
+    </w:p>
+    <w:p>
+      <w:pPr>
+        <w:jc w:val="center"/>
+        <w:rPr>
+          <w:rFonts w:hint="default"/>
+          <w:b/>
+          <w:bCs/>
+          <w:sz w:val="44"/>
+          <w:szCs w:val="44"/>
+        </w:rPr>
+      </w:pPr>
+    </w:p>
+    <w:p>
+      <w:pPr>
+        <w:jc w:val="center"/>
+        <w:rPr>
+          <w:rFonts w:hint="default"/>
+          <w:b/>
+          <w:bCs/>
+          <w:sz w:val="44"/>
+          <w:szCs w:val="44"/>
+        </w:rPr>
+      </w:pPr>
+    </w:p>
+    <w:p>
+      <w:pPr>
+        <w:jc w:val="center"/>
+        <w:rPr>
+          <w:rFonts w:hint="default"/>
+          <w:b/>
+          <w:bCs/>
+          <w:sz w:val="44"/>
+          <w:szCs w:val="44"/>
+        </w:rPr>
+      </w:pPr>
+    </w:p>
+    <w:p>
+      <w:pPr>
+        <w:jc w:val="center"/>
+        <w:rPr>
+          <w:rFonts w:hint="default"/>
+          <w:b/>
+          <w:bCs/>
+          <w:sz w:val="44"/>
+          <w:szCs w:val="44"/>
+        </w:rPr>
+      </w:pPr>
+    </w:p>
+    <w:p>
+      <w:pPr>
+        <w:jc w:val="center"/>
+        <w:rPr>
+          <w:rFonts w:hint="default"/>
+          <w:b/>
+          <w:bCs/>
+          <w:sz w:val="44"/>
+          <w:szCs w:val="44"/>
+        </w:rPr>
+      </w:pPr>
+    </w:p>
+    <w:p>
+      <w:pPr>
+        <w:jc w:val="center"/>
+        <w:rPr>
+          <w:rFonts w:hint="default"/>
+          <w:b/>
+          <w:bCs/>
+          <w:sz w:val="44"/>
+          <w:szCs w:val="44"/>
+        </w:rPr>
+      </w:pPr>
+    </w:p>
+    <w:p>
+      <w:pPr>
+        <w:jc w:val="center"/>
+        <w:rPr>
+          <w:rFonts w:hint="default"/>
+          <w:b/>
+          <w:bCs/>
+          <w:sz w:val="44"/>
+          <w:szCs w:val="44"/>
+        </w:rPr>
+      </w:pPr>
+      <w:r>
+        <w:rPr>
+          <w:rFonts w:hint="default"/>
+          <w:b/>
+          <w:bCs/>
+          <w:sz w:val="44"/>
+          <w:szCs w:val="44"/>
+        </w:rPr>
+        <w:t>Domain model explanation</w:t>
+      </w:r>
+    </w:p>
+    <w:p>
+      <w:pPr>
+        <w:jc w:val="center"/>
+        <w:rPr>
+          <w:rFonts w:hint="default"/>
+          <w:b/>
+          <w:bCs/>
+          <w:sz w:val="44"/>
+          <w:szCs w:val="44"/>
+          <w:lang w:val="en-US"/>
+        </w:rPr>
+      </w:pPr>
+      <w:r>
+        <w:rPr>
+          <w:rFonts w:hint="default"/>
+          <w:b/>
+          <w:bCs/>
+          <w:sz w:val="44"/>
+          <w:szCs w:val="44"/>
+          <w:lang w:val="en-US"/>
+        </w:rPr>
+        <w:t>Part 1A</w:t>
+      </w:r>
+    </w:p>
+    <w:p>
+      <w:pPr>
+        <w:jc w:val="center"/>
+        <w:rPr>
+          <w:rFonts w:hint="default"/>
+          <w:b w:val="0"/>
+          <w:bCs w:val="0"/>
+          <w:sz w:val="28"/>
+          <w:szCs w:val="28"/>
+          <w:lang w:val="en-US"/>
+        </w:rPr>
+      </w:pPr>
+    </w:p>
+    <w:p>
+      <w:pPr>
+        <w:jc w:val="center"/>
+        <w:rPr>
+          <w:rFonts w:hint="default"/>
+          <w:b w:val="0"/>
+          <w:bCs w:val="0"/>
+          <w:sz w:val="28"/>
+          <w:szCs w:val="28"/>
+          <w:lang w:val="en-US"/>
+        </w:rPr>
+      </w:pPr>
+    </w:p>
+    <w:p>
+      <w:pPr>
+        <w:jc w:val="center"/>
+        <w:rPr>
+          <w:rFonts w:hint="default"/>
+          <w:b w:val="0"/>
+          <w:bCs w:val="0"/>
           <w:sz w:val="36"/>
           <w:szCs w:val="36"/>
+          <w:lang w:val="en-US"/>
         </w:rPr>
       </w:pPr>
       <w:r>
@@ -20,13 +177,832 @@
           <w:bCs/>
           <w:sz w:val="36"/>
           <w:szCs w:val="36"/>
-        </w:rPr>
-        <w:t>Domain model explanation</w:t>
-      </w:r>
+          <w:lang w:val="en-US"/>
+        </w:rPr>
+        <w:t>Team:</w:t>
+      </w:r>
+      <w:r>
+        <w:rPr>
+          <w:rFonts w:hint="default"/>
+          <w:b w:val="0"/>
+          <w:bCs w:val="0"/>
+          <w:sz w:val="36"/>
+          <w:szCs w:val="36"/>
+          <w:lang w:val="en-US"/>
+        </w:rPr>
+        <w:t xml:space="preserve"> Mouse Clubhouse</w:t>
+      </w:r>
+      <w:bookmarkStart w:id="0" w:name="_GoBack"/>
+      <w:bookmarkEnd w:id="0"/>
     </w:p>
     <w:p>
       <w:pPr>
         <w:jc w:val="center"/>
+        <w:rPr>
+          <w:rFonts w:hint="default"/>
+          <w:b w:val="0"/>
+          <w:bCs w:val="0"/>
+          <w:sz w:val="36"/>
+          <w:szCs w:val="36"/>
+          <w:lang w:val="en-US"/>
+        </w:rPr>
+      </w:pPr>
+    </w:p>
+    <w:p>
+      <w:pPr>
+        <w:jc w:val="center"/>
+        <w:rPr>
+          <w:rFonts w:hint="default"/>
+          <w:b w:val="0"/>
+          <w:bCs w:val="0"/>
+          <w:sz w:val="36"/>
+          <w:szCs w:val="36"/>
+          <w:lang w:val="en-US"/>
+        </w:rPr>
+      </w:pPr>
+      <w:r>
+        <w:rPr>
+          <w:rFonts w:hint="default"/>
+          <w:b/>
+          <w:bCs/>
+          <w:sz w:val="36"/>
+          <w:szCs w:val="36"/>
+          <w:lang w:val="en-US"/>
+        </w:rPr>
+        <w:t>Team Members:</w:t>
+      </w:r>
+      <w:r>
+        <w:rPr>
+          <w:rFonts w:hint="default"/>
+          <w:b w:val="0"/>
+          <w:bCs w:val="0"/>
+          <w:sz w:val="36"/>
+          <w:szCs w:val="36"/>
+          <w:lang w:val="en-US"/>
+        </w:rPr>
+        <w:t xml:space="preserve"> </w:t>
+      </w:r>
+    </w:p>
+    <w:p>
+      <w:pPr>
+        <w:jc w:val="center"/>
+        <w:rPr>
+          <w:rFonts w:hint="default"/>
+          <w:b w:val="0"/>
+          <w:bCs w:val="0"/>
+          <w:sz w:val="36"/>
+          <w:szCs w:val="36"/>
+          <w:lang w:val="en-US"/>
+        </w:rPr>
+      </w:pPr>
+    </w:p>
+    <w:tbl>
+      <w:tblPr>
+        <w:tblStyle w:val="4"/>
+        <w:tblW w:w="0" w:type="auto"/>
+        <w:tblInd w:w="0" w:type="dxa"/>
+        <w:tblBorders>
+          <w:top w:val="single" w:color="auto" w:sz="4" w:space="0"/>
+          <w:left w:val="single" w:color="auto" w:sz="4" w:space="0"/>
+          <w:bottom w:val="single" w:color="auto" w:sz="4" w:space="0"/>
+          <w:right w:val="single" w:color="auto" w:sz="4" w:space="0"/>
+          <w:insideH w:val="single" w:color="auto" w:sz="4" w:space="0"/>
+          <w:insideV w:val="single" w:color="auto" w:sz="4" w:space="0"/>
+        </w:tblBorders>
+        <w:tblLayout w:type="autofit"/>
+        <w:tblCellMar>
+          <w:left w:w="108" w:type="dxa"/>
+          <w:right w:w="108" w:type="dxa"/>
+        </w:tblCellMar>
+      </w:tblPr>
+      <w:tblGrid>
+        <w:gridCol w:w="1101"/>
+        <w:gridCol w:w="987"/>
+        <w:gridCol w:w="1430"/>
+        <w:gridCol w:w="1571"/>
+        <w:gridCol w:w="3433"/>
+      </w:tblGrid>
+      <w:tr>
+        <w:tc>
+          <w:tcPr>
+            <w:tcW w:w="1704" w:type="dxa"/>
+          </w:tcPr>
+          <w:p>
+            <w:pPr>
+              <w:keepNext w:val="0"/>
+              <w:keepLines w:val="0"/>
+              <w:widowControl/>
+              <w:suppressLineNumbers w:val="0"/>
+              <w:jc w:val="center"/>
+              <w:rPr>
+                <w:rFonts w:hint="default"/>
+                <w:b/>
+                <w:bCs/>
+                <w:sz w:val="28"/>
+                <w:szCs w:val="28"/>
+                <w:vertAlign w:val="baseline"/>
+                <w:lang w:val="en-US"/>
+              </w:rPr>
+            </w:pPr>
+            <w:r>
+              <w:rPr>
+                <w:rFonts w:hint="default" w:asciiTheme="minorHAnsi" w:hAnsiTheme="minorHAnsi" w:eastAsiaTheme="minorEastAsia" w:cstheme="minorBidi"/>
+                <w:b/>
+                <w:bCs/>
+                <w:sz w:val="28"/>
+                <w:szCs w:val="28"/>
+                <w:vertAlign w:val="baseline"/>
+                <w:lang w:val="en-US" w:eastAsia="zh-CN" w:bidi="ar-SA"/>
+              </w:rPr>
+              <w:t>Name</w:t>
+            </w:r>
+          </w:p>
+        </w:tc>
+        <w:tc>
+          <w:tcPr>
+            <w:tcW w:w="1704" w:type="dxa"/>
+          </w:tcPr>
+          <w:p>
+            <w:pPr>
+              <w:keepNext w:val="0"/>
+              <w:keepLines w:val="0"/>
+              <w:widowControl/>
+              <w:suppressLineNumbers w:val="0"/>
+              <w:jc w:val="center"/>
+              <w:rPr>
+                <w:rFonts w:hint="default"/>
+                <w:b/>
+                <w:bCs/>
+                <w:sz w:val="28"/>
+                <w:szCs w:val="28"/>
+                <w:vertAlign w:val="baseline"/>
+                <w:lang w:val="en-US"/>
+              </w:rPr>
+            </w:pPr>
+            <w:r>
+              <w:rPr>
+                <w:rFonts w:hint="default"/>
+                <w:b/>
+                <w:bCs/>
+                <w:sz w:val="28"/>
+                <w:szCs w:val="28"/>
+                <w:vertAlign w:val="baseline"/>
+                <w:lang w:val="en-US"/>
+              </w:rPr>
+              <w:t>Student ID</w:t>
+            </w:r>
+          </w:p>
+        </w:tc>
+        <w:tc>
+          <w:tcPr>
+            <w:tcW w:w="1704" w:type="dxa"/>
+          </w:tcPr>
+          <w:p>
+            <w:pPr>
+              <w:jc w:val="center"/>
+              <w:rPr>
+                <w:rFonts w:hint="default"/>
+                <w:b/>
+                <w:bCs/>
+                <w:sz w:val="28"/>
+                <w:szCs w:val="28"/>
+                <w:vertAlign w:val="baseline"/>
+                <w:lang w:val="en-US"/>
+              </w:rPr>
+            </w:pPr>
+            <w:r>
+              <w:rPr>
+                <w:rFonts w:hint="default"/>
+                <w:b/>
+                <w:bCs/>
+                <w:sz w:val="28"/>
+                <w:szCs w:val="28"/>
+                <w:vertAlign w:val="baseline"/>
+                <w:lang w:val="en-US"/>
+              </w:rPr>
+              <w:t>Unimelb username</w:t>
+            </w:r>
+          </w:p>
+        </w:tc>
+        <w:tc>
+          <w:tcPr>
+            <w:tcW w:w="1705" w:type="dxa"/>
+          </w:tcPr>
+          <w:p>
+            <w:pPr>
+              <w:jc w:val="center"/>
+              <w:rPr>
+                <w:rFonts w:hint="default"/>
+                <w:b/>
+                <w:bCs/>
+                <w:sz w:val="28"/>
+                <w:szCs w:val="28"/>
+                <w:vertAlign w:val="baseline"/>
+                <w:lang w:val="en-US"/>
+              </w:rPr>
+            </w:pPr>
+            <w:r>
+              <w:rPr>
+                <w:rFonts w:hint="default"/>
+                <w:b/>
+                <w:bCs/>
+                <w:sz w:val="28"/>
+                <w:szCs w:val="28"/>
+                <w:vertAlign w:val="baseline"/>
+                <w:lang w:val="en-US"/>
+              </w:rPr>
+              <w:t>Github username</w:t>
+            </w:r>
+          </w:p>
+        </w:tc>
+        <w:tc>
+          <w:tcPr>
+            <w:tcW w:w="1705" w:type="dxa"/>
+          </w:tcPr>
+          <w:p>
+            <w:pPr>
+              <w:jc w:val="center"/>
+              <w:rPr>
+                <w:rFonts w:hint="default"/>
+                <w:b/>
+                <w:bCs/>
+                <w:sz w:val="28"/>
+                <w:szCs w:val="28"/>
+                <w:vertAlign w:val="baseline"/>
+                <w:lang w:val="en-US"/>
+              </w:rPr>
+            </w:pPr>
+            <w:r>
+              <w:rPr>
+                <w:rFonts w:hint="default"/>
+                <w:b/>
+                <w:bCs/>
+                <w:sz w:val="28"/>
+                <w:szCs w:val="28"/>
+                <w:vertAlign w:val="baseline"/>
+                <w:lang w:val="en-US"/>
+              </w:rPr>
+              <w:t>Email</w:t>
+            </w:r>
+          </w:p>
+        </w:tc>
+      </w:tr>
+      <w:tr>
+        <w:tc>
+          <w:tcPr>
+            <w:tcW w:w="1704" w:type="dxa"/>
+          </w:tcPr>
+          <w:p>
+            <w:pPr>
+              <w:jc w:val="center"/>
+              <w:rPr>
+                <w:rFonts w:hint="default"/>
+                <w:b w:val="0"/>
+                <w:bCs w:val="0"/>
+                <w:sz w:val="28"/>
+                <w:szCs w:val="28"/>
+                <w:vertAlign w:val="baseline"/>
+                <w:lang w:val="en-US"/>
+              </w:rPr>
+            </w:pPr>
+            <w:r>
+              <w:rPr>
+                <w:rFonts w:hint="default"/>
+                <w:b w:val="0"/>
+                <w:bCs w:val="0"/>
+                <w:sz w:val="28"/>
+                <w:szCs w:val="28"/>
+                <w:vertAlign w:val="baseline"/>
+                <w:lang w:val="en-US"/>
+              </w:rPr>
+              <w:t>Pengyuan Yu</w:t>
+            </w:r>
+          </w:p>
+        </w:tc>
+        <w:tc>
+          <w:tcPr>
+            <w:tcW w:w="1704" w:type="dxa"/>
+          </w:tcPr>
+          <w:p>
+            <w:pPr>
+              <w:jc w:val="center"/>
+              <w:rPr>
+                <w:rFonts w:hint="default"/>
+                <w:b w:val="0"/>
+                <w:bCs w:val="0"/>
+                <w:sz w:val="28"/>
+                <w:szCs w:val="28"/>
+                <w:vertAlign w:val="baseline"/>
+                <w:lang w:val="en-US"/>
+              </w:rPr>
+            </w:pPr>
+            <w:r>
+              <w:rPr>
+                <w:rFonts w:hint="default"/>
+                <w:b w:val="0"/>
+                <w:bCs w:val="0"/>
+                <w:sz w:val="28"/>
+                <w:szCs w:val="28"/>
+                <w:vertAlign w:val="baseline"/>
+                <w:lang w:val="en-US"/>
+              </w:rPr>
+              <w:t>1433539</w:t>
+            </w:r>
+          </w:p>
+        </w:tc>
+        <w:tc>
+          <w:tcPr>
+            <w:tcW w:w="1704" w:type="dxa"/>
+          </w:tcPr>
+          <w:p>
+            <w:pPr>
+              <w:jc w:val="center"/>
+              <w:rPr>
+                <w:rFonts w:hint="default"/>
+                <w:b w:val="0"/>
+                <w:bCs w:val="0"/>
+                <w:sz w:val="28"/>
+                <w:szCs w:val="28"/>
+                <w:vertAlign w:val="baseline"/>
+                <w:lang w:val="en-US"/>
+              </w:rPr>
+            </w:pPr>
+            <w:r>
+              <w:rPr>
+                <w:rFonts w:hint="default"/>
+                <w:b w:val="0"/>
+                <w:bCs w:val="0"/>
+                <w:sz w:val="28"/>
+                <w:szCs w:val="28"/>
+                <w:vertAlign w:val="baseline"/>
+                <w:lang w:val="en-US"/>
+              </w:rPr>
+              <w:t>PENGYUANY</w:t>
+            </w:r>
+          </w:p>
+        </w:tc>
+        <w:tc>
+          <w:tcPr>
+            <w:tcW w:w="1705" w:type="dxa"/>
+          </w:tcPr>
+          <w:p>
+            <w:pPr>
+              <w:jc w:val="center"/>
+              <w:rPr>
+                <w:rFonts w:hint="default"/>
+                <w:b w:val="0"/>
+                <w:bCs w:val="0"/>
+                <w:sz w:val="28"/>
+                <w:szCs w:val="28"/>
+                <w:vertAlign w:val="baseline"/>
+                <w:lang w:val="en-US"/>
+              </w:rPr>
+            </w:pPr>
+            <w:r>
+              <w:rPr>
+                <w:rFonts w:hint="default"/>
+                <w:b w:val="0"/>
+                <w:bCs w:val="0"/>
+                <w:sz w:val="28"/>
+                <w:szCs w:val="28"/>
+                <w:vertAlign w:val="baseline"/>
+                <w:lang w:val="en-US"/>
+              </w:rPr>
+              <w:t>LearningDogge</w:t>
+            </w:r>
+          </w:p>
+        </w:tc>
+        <w:tc>
+          <w:tcPr>
+            <w:tcW w:w="1705" w:type="dxa"/>
+          </w:tcPr>
+          <w:p>
+            <w:pPr>
+              <w:jc w:val="center"/>
+              <w:rPr>
+                <w:rFonts w:hint="default"/>
+                <w:b w:val="0"/>
+                <w:bCs w:val="0"/>
+                <w:sz w:val="28"/>
+                <w:szCs w:val="28"/>
+                <w:vertAlign w:val="baseline"/>
+                <w:lang w:val="en-US"/>
+              </w:rPr>
+            </w:pPr>
+            <w:r>
+              <w:rPr>
+                <w:rFonts w:hint="default"/>
+                <w:b w:val="0"/>
+                <w:bCs w:val="0"/>
+                <w:sz w:val="28"/>
+                <w:szCs w:val="28"/>
+                <w:vertAlign w:val="baseline"/>
+                <w:lang w:val="en-US"/>
+              </w:rPr>
+              <w:t>pengyuany@student.unimelb.edu.au</w:t>
+            </w:r>
+          </w:p>
+        </w:tc>
+      </w:tr>
+      <w:tr>
+        <w:tc>
+          <w:tcPr>
+            <w:tcW w:w="1704" w:type="dxa"/>
+          </w:tcPr>
+          <w:p>
+            <w:pPr>
+              <w:jc w:val="center"/>
+              <w:rPr>
+                <w:rFonts w:hint="default"/>
+                <w:b w:val="0"/>
+                <w:bCs w:val="0"/>
+                <w:sz w:val="28"/>
+                <w:szCs w:val="28"/>
+                <w:vertAlign w:val="baseline"/>
+              </w:rPr>
+            </w:pPr>
+          </w:p>
+        </w:tc>
+        <w:tc>
+          <w:tcPr>
+            <w:tcW w:w="1704" w:type="dxa"/>
+          </w:tcPr>
+          <w:p>
+            <w:pPr>
+              <w:jc w:val="center"/>
+              <w:rPr>
+                <w:rFonts w:hint="default"/>
+                <w:b w:val="0"/>
+                <w:bCs w:val="0"/>
+                <w:sz w:val="28"/>
+                <w:szCs w:val="28"/>
+                <w:vertAlign w:val="baseline"/>
+              </w:rPr>
+            </w:pPr>
+          </w:p>
+        </w:tc>
+        <w:tc>
+          <w:tcPr>
+            <w:tcW w:w="1704" w:type="dxa"/>
+          </w:tcPr>
+          <w:p>
+            <w:pPr>
+              <w:jc w:val="center"/>
+              <w:rPr>
+                <w:rFonts w:hint="default"/>
+                <w:b w:val="0"/>
+                <w:bCs w:val="0"/>
+                <w:sz w:val="28"/>
+                <w:szCs w:val="28"/>
+                <w:vertAlign w:val="baseline"/>
+              </w:rPr>
+            </w:pPr>
+          </w:p>
+        </w:tc>
+        <w:tc>
+          <w:tcPr>
+            <w:tcW w:w="1705" w:type="dxa"/>
+          </w:tcPr>
+          <w:p>
+            <w:pPr>
+              <w:jc w:val="center"/>
+              <w:rPr>
+                <w:rFonts w:hint="default"/>
+                <w:b w:val="0"/>
+                <w:bCs w:val="0"/>
+                <w:sz w:val="28"/>
+                <w:szCs w:val="28"/>
+                <w:vertAlign w:val="baseline"/>
+              </w:rPr>
+            </w:pPr>
+          </w:p>
+        </w:tc>
+        <w:tc>
+          <w:tcPr>
+            <w:tcW w:w="1705" w:type="dxa"/>
+          </w:tcPr>
+          <w:p>
+            <w:pPr>
+              <w:jc w:val="center"/>
+              <w:rPr>
+                <w:rFonts w:hint="default"/>
+                <w:b w:val="0"/>
+                <w:bCs w:val="0"/>
+                <w:sz w:val="28"/>
+                <w:szCs w:val="28"/>
+                <w:vertAlign w:val="baseline"/>
+              </w:rPr>
+            </w:pPr>
+          </w:p>
+        </w:tc>
+      </w:tr>
+      <w:tr>
+        <w:tc>
+          <w:tcPr>
+            <w:tcW w:w="1704" w:type="dxa"/>
+          </w:tcPr>
+          <w:p>
+            <w:pPr>
+              <w:jc w:val="center"/>
+              <w:rPr>
+                <w:rFonts w:hint="default"/>
+                <w:b w:val="0"/>
+                <w:bCs w:val="0"/>
+                <w:sz w:val="28"/>
+                <w:szCs w:val="28"/>
+                <w:vertAlign w:val="baseline"/>
+              </w:rPr>
+            </w:pPr>
+          </w:p>
+        </w:tc>
+        <w:tc>
+          <w:tcPr>
+            <w:tcW w:w="1704" w:type="dxa"/>
+          </w:tcPr>
+          <w:p>
+            <w:pPr>
+              <w:jc w:val="center"/>
+              <w:rPr>
+                <w:rFonts w:hint="default"/>
+                <w:b w:val="0"/>
+                <w:bCs w:val="0"/>
+                <w:sz w:val="28"/>
+                <w:szCs w:val="28"/>
+                <w:vertAlign w:val="baseline"/>
+              </w:rPr>
+            </w:pPr>
+          </w:p>
+        </w:tc>
+        <w:tc>
+          <w:tcPr>
+            <w:tcW w:w="1704" w:type="dxa"/>
+          </w:tcPr>
+          <w:p>
+            <w:pPr>
+              <w:jc w:val="center"/>
+              <w:rPr>
+                <w:rFonts w:hint="default"/>
+                <w:b w:val="0"/>
+                <w:bCs w:val="0"/>
+                <w:sz w:val="28"/>
+                <w:szCs w:val="28"/>
+                <w:vertAlign w:val="baseline"/>
+              </w:rPr>
+            </w:pPr>
+          </w:p>
+        </w:tc>
+        <w:tc>
+          <w:tcPr>
+            <w:tcW w:w="1705" w:type="dxa"/>
+          </w:tcPr>
+          <w:p>
+            <w:pPr>
+              <w:jc w:val="center"/>
+              <w:rPr>
+                <w:rFonts w:hint="default"/>
+                <w:b w:val="0"/>
+                <w:bCs w:val="0"/>
+                <w:sz w:val="28"/>
+                <w:szCs w:val="28"/>
+                <w:vertAlign w:val="baseline"/>
+              </w:rPr>
+            </w:pPr>
+          </w:p>
+        </w:tc>
+        <w:tc>
+          <w:tcPr>
+            <w:tcW w:w="1705" w:type="dxa"/>
+          </w:tcPr>
+          <w:p>
+            <w:pPr>
+              <w:jc w:val="center"/>
+              <w:rPr>
+                <w:rFonts w:hint="default"/>
+                <w:b w:val="0"/>
+                <w:bCs w:val="0"/>
+                <w:sz w:val="28"/>
+                <w:szCs w:val="28"/>
+                <w:vertAlign w:val="baseline"/>
+              </w:rPr>
+            </w:pPr>
+          </w:p>
+        </w:tc>
+      </w:tr>
+      <w:tr>
+        <w:tc>
+          <w:tcPr>
+            <w:tcW w:w="1704" w:type="dxa"/>
+          </w:tcPr>
+          <w:p>
+            <w:pPr>
+              <w:jc w:val="center"/>
+              <w:rPr>
+                <w:rFonts w:hint="default"/>
+                <w:b w:val="0"/>
+                <w:bCs w:val="0"/>
+                <w:sz w:val="28"/>
+                <w:szCs w:val="28"/>
+                <w:vertAlign w:val="baseline"/>
+              </w:rPr>
+            </w:pPr>
+          </w:p>
+        </w:tc>
+        <w:tc>
+          <w:tcPr>
+            <w:tcW w:w="1704" w:type="dxa"/>
+          </w:tcPr>
+          <w:p>
+            <w:pPr>
+              <w:jc w:val="center"/>
+              <w:rPr>
+                <w:rFonts w:hint="default"/>
+                <w:b w:val="0"/>
+                <w:bCs w:val="0"/>
+                <w:sz w:val="28"/>
+                <w:szCs w:val="28"/>
+                <w:vertAlign w:val="baseline"/>
+              </w:rPr>
+            </w:pPr>
+          </w:p>
+        </w:tc>
+        <w:tc>
+          <w:tcPr>
+            <w:tcW w:w="1704" w:type="dxa"/>
+          </w:tcPr>
+          <w:p>
+            <w:pPr>
+              <w:jc w:val="center"/>
+              <w:rPr>
+                <w:rFonts w:hint="default"/>
+                <w:b w:val="0"/>
+                <w:bCs w:val="0"/>
+                <w:sz w:val="28"/>
+                <w:szCs w:val="28"/>
+                <w:vertAlign w:val="baseline"/>
+              </w:rPr>
+            </w:pPr>
+          </w:p>
+        </w:tc>
+        <w:tc>
+          <w:tcPr>
+            <w:tcW w:w="1705" w:type="dxa"/>
+          </w:tcPr>
+          <w:p>
+            <w:pPr>
+              <w:jc w:val="center"/>
+              <w:rPr>
+                <w:rFonts w:hint="default"/>
+                <w:b w:val="0"/>
+                <w:bCs w:val="0"/>
+                <w:sz w:val="28"/>
+                <w:szCs w:val="28"/>
+                <w:vertAlign w:val="baseline"/>
+              </w:rPr>
+            </w:pPr>
+          </w:p>
+        </w:tc>
+        <w:tc>
+          <w:tcPr>
+            <w:tcW w:w="1705" w:type="dxa"/>
+          </w:tcPr>
+          <w:p>
+            <w:pPr>
+              <w:jc w:val="center"/>
+              <w:rPr>
+                <w:rFonts w:hint="default"/>
+                <w:b w:val="0"/>
+                <w:bCs w:val="0"/>
+                <w:sz w:val="28"/>
+                <w:szCs w:val="28"/>
+                <w:vertAlign w:val="baseline"/>
+              </w:rPr>
+            </w:pPr>
+          </w:p>
+        </w:tc>
+      </w:tr>
+    </w:tbl>
+    <w:p>
+      <w:pPr>
+        <w:jc w:val="center"/>
+        <w:rPr>
+          <w:rFonts w:hint="default"/>
+          <w:b/>
+          <w:bCs/>
+          <w:sz w:val="28"/>
+          <w:szCs w:val="28"/>
+        </w:rPr>
+      </w:pPr>
+    </w:p>
+    <w:p>
+      <w:pPr>
+        <w:rPr>
+          <w:rFonts w:hint="default"/>
+          <w:b/>
+          <w:bCs/>
+          <w:sz w:val="28"/>
+          <w:szCs w:val="28"/>
+          <w:lang w:val="en-US" w:eastAsia="zh-CN"/>
+        </w:rPr>
+      </w:pPr>
+      <w:r>
+        <w:rPr>
+          <w:rFonts w:hint="default"/>
+          <w:b/>
+          <w:bCs/>
+          <w:sz w:val="28"/>
+          <w:szCs w:val="28"/>
+          <w:lang w:val="en-US" w:eastAsia="zh-CN"/>
+        </w:rPr>
+        <w:br w:type="page"/>
+      </w:r>
+    </w:p>
+    <w:p>
+      <w:pPr>
+        <w:jc w:val="both"/>
+        <w:rPr>
+          <w:rFonts w:hint="default"/>
+          <w:b/>
+          <w:bCs/>
+          <w:sz w:val="28"/>
+          <w:szCs w:val="28"/>
+          <w:lang w:val="en-US" w:eastAsia="zh-CN"/>
+        </w:rPr>
+      </w:pPr>
+      <w:r>
+        <w:rPr>
+          <w:rFonts w:hint="default"/>
+          <w:b/>
+          <w:bCs/>
+          <w:sz w:val="28"/>
+          <w:szCs w:val="28"/>
+          <w:lang w:val="en-US" w:eastAsia="zh-CN"/>
+        </w:rPr>
+        <w:t>Domain Model Diagram</w:t>
+      </w:r>
+    </w:p>
+    <w:p>
+      <w:pPr>
+        <w:jc w:val="center"/>
+        <w:rPr>
+          <w:rFonts w:hint="default"/>
+          <w:b/>
+          <w:bCs/>
+          <w:sz w:val="28"/>
+          <w:szCs w:val="28"/>
+          <w:lang w:val="en-US" w:eastAsia="zh-CN"/>
+        </w:rPr>
+      </w:pPr>
+      <w:r>
+        <w:rPr>
+          <w:rFonts w:hint="default"/>
+          <w:b/>
+          <w:bCs/>
+          <w:sz w:val="28"/>
+          <w:szCs w:val="28"/>
+          <w:lang w:val="en-US" w:eastAsia="zh-CN"/>
+        </w:rPr>
+        <w:drawing>
+          <wp:inline distT="0" distB="0" distL="114300" distR="114300">
+            <wp:extent cx="5272405" cy="8098790"/>
+            <wp:effectExtent l="0" t="0" r="10795" b="3810"/>
+            <wp:docPr id="1" name="Picture 1" descr="1723108035503"/>
+            <wp:cNvGraphicFramePr>
+              <a:graphicFrameLocks xmlns:a="http://schemas.openxmlformats.org/drawingml/2006/main" noChangeAspect="1"/>
+            </wp:cNvGraphicFramePr>
+            <a:graphic xmlns:a="http://schemas.openxmlformats.org/drawingml/2006/main">
+              <a:graphicData uri="http://schemas.openxmlformats.org/drawingml/2006/picture">
+                <pic:pic xmlns:pic="http://schemas.openxmlformats.org/drawingml/2006/picture">
+                  <pic:nvPicPr>
+                    <pic:cNvPr id="1" name="Picture 1" descr="1723108035503"/>
+                    <pic:cNvPicPr>
+                      <a:picLocks noChangeAspect="1"/>
+                    </pic:cNvPicPr>
+                  </pic:nvPicPr>
+                  <pic:blipFill>
+                    <a:blip r:embed="rId4"/>
+                    <a:stretch>
+                      <a:fillRect/>
+                    </a:stretch>
+                  </pic:blipFill>
+                  <pic:spPr>
+                    <a:xfrm>
+                      <a:off x="0" y="0"/>
+                      <a:ext cx="5272405" cy="8098790"/>
+                    </a:xfrm>
+                    <a:prstGeom prst="rect">
+                      <a:avLst/>
+                    </a:prstGeom>
+                  </pic:spPr>
+                </pic:pic>
+              </a:graphicData>
+            </a:graphic>
+          </wp:inline>
+        </w:drawing>
+      </w:r>
+    </w:p>
+    <w:p>
+      <w:pPr>
+        <w:jc w:val="both"/>
         <w:rPr>
           <w:rFonts w:hint="default"/>
           <w:b/>
@@ -177,8 +1153,6 @@
         </w:rPr>
         <w:t>StudentClub represents clubs in university. Administrators of a ceratin student club can organize events submit funding applications through this class. Also club id, name and description are stored in StudentClub.</w:t>
       </w:r>
-      <w:bookmarkStart w:id="0" w:name="_GoBack"/>
-      <w:bookmarkEnd w:id="0"/>
     </w:p>
     <w:p>
       <w:pPr>
@@ -721,6 +1695,25 @@
       </w:tblCellMar>
     </w:tblPr>
   </w:style>
+  <w:style w:type="table" w:styleId="4">
+    <w:name w:val="Table Grid"/>
+    <w:basedOn w:val="3"/>
+    <w:uiPriority w:val="0"/>
+    <w:pPr>
+      <w:widowControl w:val="0"/>
+      <w:jc w:val="both"/>
+    </w:pPr>
+    <w:tblPr>
+      <w:tblBorders>
+        <w:top w:val="single" w:color="auto" w:sz="4" w:space="0"/>
+        <w:left w:val="single" w:color="auto" w:sz="4" w:space="0"/>
+        <w:bottom w:val="single" w:color="auto" w:sz="4" w:space="0"/>
+        <w:right w:val="single" w:color="auto" w:sz="4" w:space="0"/>
+        <w:insideH w:val="single" w:color="auto" w:sz="4" w:space="0"/>
+        <w:insideV w:val="single" w:color="auto" w:sz="4" w:space="0"/>
+      </w:tblBorders>
+    </w:tblPr>
+  </w:style>
 </w:styles>
 </file>
 

</xml_diff>

<commit_message>
Add  personal information of rongwang
</commit_message>
<xml_diff>
--- a/docs/part 1/part 1a.docx
+++ b/docs/part 1/part 1a.docx
@@ -1,6 +1,6 @@
 
 <file path=word/document.xml><?xml version="1.0" encoding="utf-8"?>
-<w:document xmlns:wpc="http://schemas.microsoft.com/office/word/2010/wordprocessingCanvas" xmlns:cx="http://schemas.microsoft.com/office/drawing/2014/chartex" xmlns:cx1="http://schemas.microsoft.com/office/drawing/2015/9/8/chartex" xmlns:cx2="http://schemas.microsoft.com/office/drawing/2015/10/21/chartex" xmlns:cx3="http://schemas.microsoft.com/office/drawing/2016/5/9/chartex" xmlns:cx4="http://schemas.microsoft.com/office/drawing/2016/5/10/chartex" xmlns:cx5="http://schemas.microsoft.com/office/drawing/2016/5/11/chartex" xmlns:cx6="http://schemas.microsoft.com/office/drawing/2016/5/12/chartex" xmlns:cx7="http://schemas.microsoft.com/office/drawing/2016/5/13/chartex" xmlns:cx8="http://schemas.microsoft.com/office/drawing/2016/5/14/chartex" xmlns:mc="http://schemas.openxmlformats.org/markup-compatibility/2006" xmlns:aink="http://schemas.microsoft.com/office/drawing/2016/ink" xmlns:am3d="http://schemas.microsoft.com/office/drawing/2017/model3d" xmlns:o="urn:schemas-microsoft-com:office:office" xmlns:oel="http://schemas.microsoft.com/office/2019/extlst" xmlns:r="http://schemas.openxmlformats.org/officeDocument/2006/relationships" xmlns:m="http://schemas.openxmlformats.org/officeDocument/2006/math" xmlns:v="urn:schemas-microsoft-com:vml" xmlns:wp14="http://schemas.microsoft.com/office/word/2010/wordprocessingDrawing" xmlns:wp="http://schemas.openxmlformats.org/drawingml/2006/wordprocessingDrawing" xmlns:w10="urn:schemas-microsoft-com:office:word" xmlns:w="http://schemas.openxmlformats.org/wordprocessingml/2006/main" xmlns:w14="http://schemas.microsoft.com/office/word/2010/wordml" xmlns:w15="http://schemas.microsoft.com/office/word/2012/wordml" xmlns:w16cex="http://schemas.microsoft.com/office/word/2018/wordml/cex" xmlns:w16cid="http://schemas.microsoft.com/office/word/2016/wordml/cid" xmlns:w16="http://schemas.microsoft.com/office/word/2018/wordml" xmlns:w16sdtdh="http://schemas.microsoft.com/office/word/2020/wordml/sdtdatahash" xmlns:w16se="http://schemas.microsoft.com/office/word/2015/wordml/symex" xmlns:wpg="http://schemas.microsoft.com/office/word/2010/wordprocessingGroup" xmlns:wpi="http://schemas.microsoft.com/office/word/2010/wordprocessingInk" xmlns:wne="http://schemas.microsoft.com/office/word/2006/wordml" xmlns:wps="http://schemas.microsoft.com/office/word/2010/wordprocessingShape" mc:Ignorable="w14 w15 w16se w16cid w16 w16cex w16sdtdh wp14">
+<w:document xmlns:wpc="http://schemas.microsoft.com/office/word/2010/wordprocessingCanvas" xmlns:cx="http://schemas.microsoft.com/office/drawing/2014/chartex" xmlns:cx1="http://schemas.microsoft.com/office/drawing/2015/9/8/chartex" xmlns:cx2="http://schemas.microsoft.com/office/drawing/2015/10/21/chartex" xmlns:cx3="http://schemas.microsoft.com/office/drawing/2016/5/9/chartex" xmlns:cx4="http://schemas.microsoft.com/office/drawing/2016/5/10/chartex" xmlns:cx5="http://schemas.microsoft.com/office/drawing/2016/5/11/chartex" xmlns:cx6="http://schemas.microsoft.com/office/drawing/2016/5/12/chartex" xmlns:cx7="http://schemas.microsoft.com/office/drawing/2016/5/13/chartex" xmlns:cx8="http://schemas.microsoft.com/office/drawing/2016/5/14/chartex" xmlns:mc="http://schemas.openxmlformats.org/markup-compatibility/2006" xmlns:aink="http://schemas.microsoft.com/office/drawing/2016/ink" xmlns:am3d="http://schemas.microsoft.com/office/drawing/2017/model3d" xmlns:o="urn:schemas-microsoft-com:office:office" xmlns:oel="http://schemas.microsoft.com/office/2019/extlst" xmlns:r="http://schemas.openxmlformats.org/officeDocument/2006/relationships" xmlns:m="http://schemas.openxmlformats.org/officeDocument/2006/math" xmlns:v="urn:schemas-microsoft-com:vml" xmlns:wp14="http://schemas.microsoft.com/office/word/2010/wordprocessingDrawing" xmlns:wp="http://schemas.openxmlformats.org/drawingml/2006/wordprocessingDrawing" xmlns:w10="urn:schemas-microsoft-com:office:word" xmlns:w="http://schemas.openxmlformats.org/wordprocessingml/2006/main" xmlns:w14="http://schemas.microsoft.com/office/word/2010/wordml" xmlns:w15="http://schemas.microsoft.com/office/word/2012/wordml" xmlns:w16cex="http://schemas.microsoft.com/office/word/2018/wordml/cex" xmlns:w16cid="http://schemas.microsoft.com/office/word/2016/wordml/cid" xmlns:w16="http://schemas.microsoft.com/office/word/2018/wordml" xmlns:w16du="http://schemas.microsoft.com/office/word/2023/wordml/word16du" xmlns:w16sdtdh="http://schemas.microsoft.com/office/word/2020/wordml/sdtdatahash" xmlns:w16se="http://schemas.microsoft.com/office/word/2015/wordml/symex" xmlns:wpg="http://schemas.microsoft.com/office/word/2010/wordprocessingGroup" xmlns:wpi="http://schemas.microsoft.com/office/word/2010/wordprocessingInk" xmlns:wne="http://schemas.microsoft.com/office/word/2006/wordml" xmlns:wps="http://schemas.microsoft.com/office/word/2010/wordprocessingShape" mc:Ignorable="w14 w15 w16se w16cid w16 w16cex w16sdtdh w16du wp14">
   <w:body>
     <w:p>
       <w:pPr>
@@ -221,7 +221,7 @@
       <w:tr>
         <w:tc>
           <w:tcPr>
-            <w:tcW w:w="1704" w:type="dxa"/>
+            <w:tcW w:w="1093" w:type="dxa"/>
           </w:tcPr>
           <w:p>
             <w:pPr>
@@ -247,7 +247,7 @@
         </w:tc>
         <w:tc>
           <w:tcPr>
-            <w:tcW w:w="1704" w:type="dxa"/>
+            <w:tcW w:w="993" w:type="dxa"/>
           </w:tcPr>
           <w:p>
             <w:pPr>
@@ -273,7 +273,7 @@
         </w:tc>
         <w:tc>
           <w:tcPr>
-            <w:tcW w:w="1704" w:type="dxa"/>
+            <w:tcW w:w="1365" w:type="dxa"/>
           </w:tcPr>
           <w:p>
             <w:pPr>
@@ -309,7 +309,7 @@
         </w:tc>
         <w:tc>
           <w:tcPr>
-            <w:tcW w:w="1705" w:type="dxa"/>
+            <w:tcW w:w="1546" w:type="dxa"/>
           </w:tcPr>
           <w:p>
             <w:pPr>
@@ -345,7 +345,7 @@
         </w:tc>
         <w:tc>
           <w:tcPr>
-            <w:tcW w:w="1705" w:type="dxa"/>
+            <w:tcW w:w="3525" w:type="dxa"/>
           </w:tcPr>
           <w:p>
             <w:pPr>
@@ -372,7 +372,7 @@
       <w:tr>
         <w:tc>
           <w:tcPr>
-            <w:tcW w:w="1704" w:type="dxa"/>
+            <w:tcW w:w="1093" w:type="dxa"/>
           </w:tcPr>
           <w:p>
             <w:pPr>
@@ -402,7 +402,7 @@
         </w:tc>
         <w:tc>
           <w:tcPr>
-            <w:tcW w:w="1704" w:type="dxa"/>
+            <w:tcW w:w="993" w:type="dxa"/>
           </w:tcPr>
           <w:p>
             <w:pPr>
@@ -423,7 +423,7 @@
         </w:tc>
         <w:tc>
           <w:tcPr>
-            <w:tcW w:w="1704" w:type="dxa"/>
+            <w:tcW w:w="1365" w:type="dxa"/>
           </w:tcPr>
           <w:p>
             <w:pPr>
@@ -444,7 +444,7 @@
         </w:tc>
         <w:tc>
           <w:tcPr>
-            <w:tcW w:w="1705" w:type="dxa"/>
+            <w:tcW w:w="1546" w:type="dxa"/>
           </w:tcPr>
           <w:p>
             <w:pPr>
@@ -467,7 +467,7 @@
         </w:tc>
         <w:tc>
           <w:tcPr>
-            <w:tcW w:w="1705" w:type="dxa"/>
+            <w:tcW w:w="3525" w:type="dxa"/>
           </w:tcPr>
           <w:p>
             <w:pPr>
@@ -490,7 +490,7 @@
       <w:tr>
         <w:tc>
           <w:tcPr>
-            <w:tcW w:w="1704" w:type="dxa"/>
+            <w:tcW w:w="1093" w:type="dxa"/>
           </w:tcPr>
           <w:p>
             <w:pPr>
@@ -522,7 +522,7 @@
         </w:tc>
         <w:tc>
           <w:tcPr>
-            <w:tcW w:w="1704" w:type="dxa"/>
+            <w:tcW w:w="993" w:type="dxa"/>
           </w:tcPr>
           <w:p>
             <w:pPr>
@@ -544,7 +544,7 @@
         </w:tc>
         <w:tc>
           <w:tcPr>
-            <w:tcW w:w="1704" w:type="dxa"/>
+            <w:tcW w:w="1365" w:type="dxa"/>
           </w:tcPr>
           <w:p>
             <w:pPr>
@@ -568,7 +568,7 @@
         </w:tc>
         <w:tc>
           <w:tcPr>
-            <w:tcW w:w="1705" w:type="dxa"/>
+            <w:tcW w:w="1546" w:type="dxa"/>
           </w:tcPr>
           <w:p>
             <w:pPr>
@@ -591,7 +591,7 @@
         </w:tc>
         <w:tc>
           <w:tcPr>
-            <w:tcW w:w="1705" w:type="dxa"/>
+            <w:tcW w:w="3525" w:type="dxa"/>
           </w:tcPr>
           <w:p>
             <w:pPr>
@@ -614,7 +614,7 @@
       <w:tr>
         <w:tc>
           <w:tcPr>
-            <w:tcW w:w="1704" w:type="dxa"/>
+            <w:tcW w:w="1093" w:type="dxa"/>
           </w:tcPr>
           <w:p>
             <w:pPr>
@@ -636,13 +636,12 @@
         </w:tc>
         <w:tc>
           <w:tcPr>
-            <w:tcW w:w="1704" w:type="dxa"/>
+            <w:tcW w:w="993" w:type="dxa"/>
           </w:tcPr>
           <w:p>
             <w:pPr>
               <w:jc w:val="center"/>
               <w:rPr>
-                <w:rFonts w:hint="eastAsia"/>
                 <w:sz w:val="28"/>
                 <w:szCs w:val="28"/>
               </w:rPr>
@@ -659,7 +658,7 @@
         </w:tc>
         <w:tc>
           <w:tcPr>
-            <w:tcW w:w="1704" w:type="dxa"/>
+            <w:tcW w:w="1365" w:type="dxa"/>
           </w:tcPr>
           <w:p>
             <w:pPr>
@@ -681,7 +680,7 @@
         </w:tc>
         <w:tc>
           <w:tcPr>
-            <w:tcW w:w="1705" w:type="dxa"/>
+            <w:tcW w:w="1546" w:type="dxa"/>
           </w:tcPr>
           <w:p>
             <w:pPr>
@@ -702,7 +701,7 @@
         </w:tc>
         <w:tc>
           <w:tcPr>
-            <w:tcW w:w="1705" w:type="dxa"/>
+            <w:tcW w:w="3525" w:type="dxa"/>
           </w:tcPr>
           <w:p>
             <w:pPr>
@@ -725,7 +724,7 @@
       <w:tr>
         <w:tc>
           <w:tcPr>
-            <w:tcW w:w="1704" w:type="dxa"/>
+            <w:tcW w:w="1093" w:type="dxa"/>
           </w:tcPr>
           <w:p>
             <w:pPr>
@@ -735,11 +734,18 @@
                 <w:szCs w:val="28"/>
               </w:rPr>
             </w:pPr>
+            <w:r>
+              <w:rPr>
+                <w:sz w:val="28"/>
+                <w:szCs w:val="28"/>
+              </w:rPr>
+              <w:t>Rong Wang</w:t>
+            </w:r>
           </w:p>
         </w:tc>
         <w:tc>
           <w:tcPr>
-            <w:tcW w:w="1704" w:type="dxa"/>
+            <w:tcW w:w="993" w:type="dxa"/>
           </w:tcPr>
           <w:p>
             <w:pPr>
@@ -749,11 +755,18 @@
                 <w:szCs w:val="28"/>
               </w:rPr>
             </w:pPr>
+            <w:r>
+              <w:rPr>
+                <w:sz w:val="28"/>
+                <w:szCs w:val="28"/>
+              </w:rPr>
+              <w:t>1373126</w:t>
+            </w:r>
           </w:p>
         </w:tc>
         <w:tc>
           <w:tcPr>
-            <w:tcW w:w="1704" w:type="dxa"/>
+            <w:tcW w:w="1365" w:type="dxa"/>
           </w:tcPr>
           <w:p>
             <w:pPr>
@@ -763,11 +776,18 @@
                 <w:szCs w:val="28"/>
               </w:rPr>
             </w:pPr>
+            <w:r>
+              <w:rPr>
+                <w:sz w:val="28"/>
+                <w:szCs w:val="28"/>
+              </w:rPr>
+              <w:t>RONGWANG</w:t>
+            </w:r>
           </w:p>
         </w:tc>
         <w:tc>
           <w:tcPr>
-            <w:tcW w:w="1705" w:type="dxa"/>
+            <w:tcW w:w="1546" w:type="dxa"/>
           </w:tcPr>
           <w:p>
             <w:pPr>
@@ -777,11 +797,20 @@
                 <w:szCs w:val="28"/>
               </w:rPr>
             </w:pPr>
+            <w:proofErr w:type="spellStart"/>
+            <w:r>
+              <w:rPr>
+                <w:sz w:val="28"/>
+                <w:szCs w:val="28"/>
+              </w:rPr>
+              <w:t>nanlour</w:t>
+            </w:r>
+            <w:proofErr w:type="spellEnd"/>
           </w:p>
         </w:tc>
         <w:tc>
           <w:tcPr>
-            <w:tcW w:w="1705" w:type="dxa"/>
+            <w:tcW w:w="3525" w:type="dxa"/>
           </w:tcPr>
           <w:p>
             <w:pPr>
@@ -791,6 +820,13 @@
                 <w:szCs w:val="28"/>
               </w:rPr>
             </w:pPr>
+            <w:r>
+              <w:rPr>
+                <w:sz w:val="28"/>
+                <w:szCs w:val="28"/>
+              </w:rPr>
+              <w:t>rongwang@student.unimelb.edu.au</w:t>
+            </w:r>
           </w:p>
         </w:tc>
       </w:tr>
@@ -1020,118 +1056,413 @@
           <w:shd w:val="clear" w:color="auto" w:fill="FFFFFF"/>
           <w:lang w:bidi="ar"/>
         </w:rPr>
-        <w:t xml:space="preserve">A student </w:t>
-      </w:r>
+        <w:t>A student has the ability to be a part of multiple </w:t>
+      </w:r>
+      <w:proofErr w:type="spellStart"/>
+      <w:r>
+        <w:rPr>
+          <w:rStyle w:val="HTML"/>
+          <w:rFonts w:ascii="Consolas" w:eastAsia="Consolas" w:hAnsi="Consolas" w:cs="Consolas"/>
+          <w:sz w:val="16"/>
+          <w:szCs w:val="16"/>
+          <w:shd w:val="clear" w:color="auto" w:fill="FFFFFF"/>
+          <w:lang w:bidi="ar"/>
+        </w:rPr>
+        <w:t>StudentClub</w:t>
+      </w:r>
+      <w:r>
+        <w:rPr>
+          <w:rFonts w:ascii="Segoe UI" w:eastAsia="Segoe UI" w:hAnsi="Segoe UI" w:cs="Segoe UI"/>
+          <w:sz w:val="16"/>
+          <w:szCs w:val="16"/>
+          <w:shd w:val="clear" w:color="auto" w:fill="FFFFFF"/>
+          <w:lang w:bidi="ar"/>
+        </w:rPr>
+        <w:t>s</w:t>
+      </w:r>
+      <w:proofErr w:type="spellEnd"/>
+      <w:r>
+        <w:rPr>
+          <w:rFonts w:ascii="Segoe UI" w:eastAsia="Segoe UI" w:hAnsi="Segoe UI" w:cs="Segoe UI"/>
+          <w:sz w:val="16"/>
+          <w:szCs w:val="16"/>
+          <w:shd w:val="clear" w:color="auto" w:fill="FFFFFF"/>
+          <w:lang w:bidi="ar"/>
+        </w:rPr>
+        <w:t>, enabling them to engage in a diverse range of activities and interests. They can also RSVP to various </w:t>
+      </w:r>
+      <w:r>
+        <w:rPr>
+          <w:rStyle w:val="HTML"/>
+          <w:rFonts w:ascii="Consolas" w:eastAsia="Consolas" w:hAnsi="Consolas" w:cs="Consolas"/>
+          <w:sz w:val="16"/>
+          <w:szCs w:val="16"/>
+          <w:shd w:val="clear" w:color="auto" w:fill="FFFFFF"/>
+          <w:lang w:bidi="ar"/>
+        </w:rPr>
+        <w:t>Event</w:t>
+      </w:r>
+      <w:r>
+        <w:rPr>
+          <w:rFonts w:ascii="Segoe UI" w:eastAsia="Segoe UI" w:hAnsi="Segoe UI" w:cs="Segoe UI"/>
+          <w:sz w:val="16"/>
+          <w:szCs w:val="16"/>
+          <w:shd w:val="clear" w:color="auto" w:fill="FFFFFF"/>
+          <w:lang w:bidi="ar"/>
+        </w:rPr>
+        <w:t>s hosted by different clubs. The </w:t>
+      </w:r>
+      <w:proofErr w:type="spellStart"/>
+      <w:r>
+        <w:rPr>
+          <w:rStyle w:val="HTML"/>
+          <w:rFonts w:ascii="Consolas" w:eastAsia="Consolas" w:hAnsi="Consolas" w:cs="Consolas"/>
+          <w:sz w:val="16"/>
+          <w:szCs w:val="16"/>
+          <w:shd w:val="clear" w:color="auto" w:fill="FFFFFF"/>
+          <w:lang w:bidi="ar"/>
+        </w:rPr>
+        <w:t>viewEvents</w:t>
+      </w:r>
+      <w:proofErr w:type="spellEnd"/>
+      <w:r>
+        <w:rPr>
+          <w:rFonts w:ascii="Segoe UI" w:eastAsia="Segoe UI" w:hAnsi="Segoe UI" w:cs="Segoe UI"/>
+          <w:sz w:val="16"/>
+          <w:szCs w:val="16"/>
+          <w:shd w:val="clear" w:color="auto" w:fill="FFFFFF"/>
+          <w:lang w:bidi="ar"/>
+        </w:rPr>
+        <w:t> method allows a student to browse through a list of all the available events, providing them with details such as the event's title, description, venue, and date. The </w:t>
+      </w:r>
+      <w:proofErr w:type="spellStart"/>
+      <w:r>
+        <w:rPr>
+          <w:rStyle w:val="HTML"/>
+          <w:rFonts w:ascii="Consolas" w:eastAsia="Consolas" w:hAnsi="Consolas" w:cs="Consolas"/>
+          <w:sz w:val="16"/>
+          <w:szCs w:val="16"/>
+          <w:shd w:val="clear" w:color="auto" w:fill="FFFFFF"/>
+          <w:lang w:bidi="ar"/>
+        </w:rPr>
+        <w:t>rsvpEvent</w:t>
+      </w:r>
+      <w:proofErr w:type="spellEnd"/>
+      <w:r>
+        <w:rPr>
+          <w:rStyle w:val="HTML"/>
+          <w:rFonts w:ascii="Consolas" w:eastAsia="Consolas" w:hAnsi="Consolas" w:cs="Consolas"/>
+          <w:sz w:val="16"/>
+          <w:szCs w:val="16"/>
+          <w:shd w:val="clear" w:color="auto" w:fill="FFFFFF"/>
+          <w:lang w:bidi="ar"/>
+        </w:rPr>
+        <w:t>(</w:t>
+      </w:r>
+      <w:proofErr w:type="spellStart"/>
+      <w:r>
+        <w:rPr>
+          <w:rStyle w:val="HTML"/>
+          <w:rFonts w:ascii="Consolas" w:eastAsia="Consolas" w:hAnsi="Consolas" w:cs="Consolas"/>
+          <w:sz w:val="16"/>
+          <w:szCs w:val="16"/>
+          <w:shd w:val="clear" w:color="auto" w:fill="FFFFFF"/>
+          <w:lang w:bidi="ar"/>
+        </w:rPr>
+        <w:t>eventId</w:t>
+      </w:r>
+      <w:proofErr w:type="spellEnd"/>
+      <w:r>
+        <w:rPr>
+          <w:rStyle w:val="HTML"/>
+          <w:rFonts w:ascii="Consolas" w:eastAsia="Consolas" w:hAnsi="Consolas" w:cs="Consolas"/>
+          <w:sz w:val="16"/>
+          <w:szCs w:val="16"/>
+          <w:shd w:val="clear" w:color="auto" w:fill="FFFFFF"/>
+          <w:lang w:bidi="ar"/>
+        </w:rPr>
+        <w:t>)</w:t>
+      </w:r>
+      <w:r>
+        <w:rPr>
+          <w:rFonts w:ascii="Segoe UI" w:eastAsia="Segoe UI" w:hAnsi="Segoe UI" w:cs="Segoe UI"/>
+          <w:sz w:val="16"/>
+          <w:szCs w:val="16"/>
+          <w:shd w:val="clear" w:color="auto" w:fill="FFFFFF"/>
+          <w:lang w:bidi="ar"/>
+        </w:rPr>
+        <w:t> method enables a student to express their intention to attend an event by providing the unique identifier of the event. In case a student's plans change, the </w:t>
+      </w:r>
+      <w:proofErr w:type="spellStart"/>
+      <w:r>
+        <w:rPr>
+          <w:rStyle w:val="HTML"/>
+          <w:rFonts w:ascii="Consolas" w:eastAsia="Consolas" w:hAnsi="Consolas" w:cs="Consolas"/>
+          <w:sz w:val="16"/>
+          <w:szCs w:val="16"/>
+          <w:shd w:val="clear" w:color="auto" w:fill="FFFFFF"/>
+          <w:lang w:bidi="ar"/>
+        </w:rPr>
+        <w:t>cancelRSVP</w:t>
+      </w:r>
+      <w:proofErr w:type="spellEnd"/>
+      <w:r>
+        <w:rPr>
+          <w:rStyle w:val="HTML"/>
+          <w:rFonts w:ascii="Consolas" w:eastAsia="Consolas" w:hAnsi="Consolas" w:cs="Consolas"/>
+          <w:sz w:val="16"/>
+          <w:szCs w:val="16"/>
+          <w:shd w:val="clear" w:color="auto" w:fill="FFFFFF"/>
+          <w:lang w:bidi="ar"/>
+        </w:rPr>
+        <w:t>(</w:t>
+      </w:r>
+      <w:proofErr w:type="spellStart"/>
+      <w:r>
+        <w:rPr>
+          <w:rStyle w:val="HTML"/>
+          <w:rFonts w:ascii="Consolas" w:eastAsia="Consolas" w:hAnsi="Consolas" w:cs="Consolas"/>
+          <w:sz w:val="16"/>
+          <w:szCs w:val="16"/>
+          <w:shd w:val="clear" w:color="auto" w:fill="FFFFFF"/>
+          <w:lang w:bidi="ar"/>
+        </w:rPr>
+        <w:t>eventId</w:t>
+      </w:r>
+      <w:proofErr w:type="spellEnd"/>
+      <w:r>
+        <w:rPr>
+          <w:rStyle w:val="HTML"/>
+          <w:rFonts w:ascii="Consolas" w:eastAsia="Consolas" w:hAnsi="Consolas" w:cs="Consolas"/>
+          <w:sz w:val="16"/>
+          <w:szCs w:val="16"/>
+          <w:shd w:val="clear" w:color="auto" w:fill="FFFFFF"/>
+          <w:lang w:bidi="ar"/>
+        </w:rPr>
+        <w:t>)</w:t>
+      </w:r>
+      <w:r>
+        <w:rPr>
+          <w:rFonts w:ascii="Segoe UI" w:eastAsia="Segoe UI" w:hAnsi="Segoe UI" w:cs="Segoe UI"/>
+          <w:sz w:val="16"/>
+          <w:szCs w:val="16"/>
+          <w:shd w:val="clear" w:color="auto" w:fill="FFFFFF"/>
+          <w:lang w:bidi="ar"/>
+        </w:rPr>
+        <w:t> method allows them to withdraw their RSVP for a particular event, which in turn updates the available capacity for that event.</w:t>
+      </w:r>
+    </w:p>
+    <w:p/>
+    <w:p>
+      <w:pPr>
+        <w:shd w:val="clear" w:color="auto" w:fill="FFFFFF"/>
+        <w:rPr>
+          <w:rFonts w:ascii="Segoe UI" w:eastAsia="Segoe UI" w:hAnsi="Segoe UI" w:cs="Segoe UI"/>
+          <w:sz w:val="16"/>
+          <w:szCs w:val="16"/>
+        </w:rPr>
+      </w:pPr>
+      <w:proofErr w:type="spellStart"/>
+      <w:r>
+        <w:rPr>
+          <w:rStyle w:val="a4"/>
+          <w:rFonts w:ascii="Segoe UI" w:eastAsia="Segoe UI" w:hAnsi="Segoe UI" w:cs="Segoe UI"/>
+          <w:bCs/>
+          <w:sz w:val="16"/>
+          <w:szCs w:val="16"/>
+          <w:shd w:val="clear" w:color="auto" w:fill="FFFFFF"/>
+          <w:lang w:bidi="ar"/>
+        </w:rPr>
+        <w:t>StudentClub</w:t>
+      </w:r>
+      <w:proofErr w:type="spellEnd"/>
+    </w:p>
+    <w:p/>
+    <w:p>
+      <w:pPr>
+        <w:shd w:val="clear" w:color="auto" w:fill="FFFFFF"/>
+        <w:rPr>
+          <w:rFonts w:ascii="Segoe UI" w:eastAsia="Segoe UI" w:hAnsi="Segoe UI" w:cs="Segoe UI"/>
+          <w:sz w:val="16"/>
+          <w:szCs w:val="16"/>
+        </w:rPr>
+      </w:pPr>
+      <w:r>
+        <w:rPr>
+          <w:rFonts w:ascii="Segoe UI" w:eastAsia="Segoe UI" w:hAnsi="Segoe UI" w:cs="Segoe UI"/>
+          <w:sz w:val="16"/>
+          <w:szCs w:val="16"/>
+          <w:shd w:val="clear" w:color="auto" w:fill="FFFFFF"/>
+          <w:lang w:bidi="ar"/>
+        </w:rPr>
+        <w:t>The </w:t>
+      </w:r>
+      <w:proofErr w:type="spellStart"/>
+      <w:r>
+        <w:rPr>
+          <w:rStyle w:val="HTML"/>
+          <w:rFonts w:ascii="Consolas" w:eastAsia="Consolas" w:hAnsi="Consolas" w:cs="Consolas"/>
+          <w:sz w:val="16"/>
+          <w:szCs w:val="16"/>
+          <w:shd w:val="clear" w:color="auto" w:fill="FFFFFF"/>
+          <w:lang w:bidi="ar"/>
+        </w:rPr>
+        <w:t>StudentClub</w:t>
+      </w:r>
+      <w:proofErr w:type="spellEnd"/>
+      <w:r>
+        <w:rPr>
+          <w:rFonts w:ascii="Segoe UI" w:eastAsia="Segoe UI" w:hAnsi="Segoe UI" w:cs="Segoe UI"/>
+          <w:sz w:val="16"/>
+          <w:szCs w:val="16"/>
+          <w:shd w:val="clear" w:color="auto" w:fill="FFFFFF"/>
+          <w:lang w:bidi="ar"/>
+        </w:rPr>
+        <w:t> class represents the various clubs that exist within the university. Each club has a unique </w:t>
+      </w:r>
+      <w:r>
+        <w:rPr>
+          <w:rStyle w:val="HTML"/>
+          <w:rFonts w:ascii="Consolas" w:eastAsia="Consolas" w:hAnsi="Consolas" w:cs="Consolas"/>
+          <w:sz w:val="16"/>
+          <w:szCs w:val="16"/>
+          <w:shd w:val="clear" w:color="auto" w:fill="FFFFFF"/>
+          <w:lang w:bidi="ar"/>
+        </w:rPr>
+        <w:t>id</w:t>
+      </w:r>
+      <w:r>
+        <w:rPr>
+          <w:rFonts w:ascii="Segoe UI" w:eastAsia="Segoe UI" w:hAnsi="Segoe UI" w:cs="Segoe UI"/>
+          <w:sz w:val="16"/>
+          <w:szCs w:val="16"/>
+          <w:shd w:val="clear" w:color="auto" w:fill="FFFFFF"/>
+          <w:lang w:bidi="ar"/>
+        </w:rPr>
+        <w:t> for identification, a distinct </w:t>
+      </w:r>
+      <w:r>
+        <w:rPr>
+          <w:rStyle w:val="HTML"/>
+          <w:rFonts w:ascii="Consolas" w:eastAsia="Consolas" w:hAnsi="Consolas" w:cs="Consolas"/>
+          <w:sz w:val="16"/>
+          <w:szCs w:val="16"/>
+          <w:shd w:val="clear" w:color="auto" w:fill="FFFFFF"/>
+          <w:lang w:bidi="ar"/>
+        </w:rPr>
+        <w:t>name</w:t>
+      </w:r>
+      <w:r>
+        <w:rPr>
+          <w:rFonts w:ascii="Segoe UI" w:eastAsia="Segoe UI" w:hAnsi="Segoe UI" w:cs="Segoe UI"/>
+          <w:sz w:val="16"/>
+          <w:szCs w:val="16"/>
+          <w:shd w:val="clear" w:color="auto" w:fill="FFFFFF"/>
+          <w:lang w:bidi="ar"/>
+        </w:rPr>
+        <w:t> that reflects its nature or theme, and a </w:t>
+      </w:r>
+      <w:r>
+        <w:rPr>
+          <w:rStyle w:val="HTML"/>
+          <w:rFonts w:ascii="Consolas" w:eastAsia="Consolas" w:hAnsi="Consolas" w:cs="Consolas"/>
+          <w:sz w:val="16"/>
+          <w:szCs w:val="16"/>
+          <w:shd w:val="clear" w:color="auto" w:fill="FFFFFF"/>
+          <w:lang w:bidi="ar"/>
+        </w:rPr>
+        <w:t>description</w:t>
+      </w:r>
+      <w:r>
+        <w:rPr>
+          <w:rFonts w:ascii="Segoe UI" w:eastAsia="Segoe UI" w:hAnsi="Segoe UI" w:cs="Segoe UI"/>
+          <w:sz w:val="16"/>
+          <w:szCs w:val="16"/>
+          <w:shd w:val="clear" w:color="auto" w:fill="FFFFFF"/>
+          <w:lang w:bidi="ar"/>
+        </w:rPr>
+        <w:t> that gives potential members and others an understanding of the club's goals and activities.</w:t>
+      </w:r>
+    </w:p>
+    <w:p/>
+    <w:p>
+      <w:pPr>
+        <w:shd w:val="clear" w:color="auto" w:fill="FFFFFF"/>
+        <w:rPr>
+          <w:rFonts w:ascii="Segoe UI" w:eastAsia="Segoe UI" w:hAnsi="Segoe UI" w:cs="Segoe UI"/>
+          <w:sz w:val="16"/>
+          <w:szCs w:val="16"/>
+        </w:rPr>
+      </w:pPr>
+      <w:r>
+        <w:rPr>
+          <w:rFonts w:ascii="Segoe UI" w:eastAsia="Segoe UI" w:hAnsi="Segoe UI" w:cs="Segoe UI"/>
+          <w:sz w:val="16"/>
+          <w:szCs w:val="16"/>
+          <w:shd w:val="clear" w:color="auto" w:fill="FFFFFF"/>
+          <w:lang w:bidi="ar"/>
+        </w:rPr>
+        <w:t>The administrators of a student club have the power to organize events through the </w:t>
+      </w:r>
+      <w:proofErr w:type="spellStart"/>
       <w:proofErr w:type="gramStart"/>
       <w:r>
         <w:rPr>
-          <w:rFonts w:ascii="Segoe UI" w:eastAsia="Segoe UI" w:hAnsi="Segoe UI" w:cs="Segoe UI"/>
-          <w:sz w:val="16"/>
-          <w:szCs w:val="16"/>
-          <w:shd w:val="clear" w:color="auto" w:fill="FFFFFF"/>
-          <w:lang w:bidi="ar"/>
-        </w:rPr>
-        <w:t>has the ability to</w:t>
+          <w:rStyle w:val="HTML"/>
+          <w:rFonts w:ascii="Consolas" w:eastAsia="Consolas" w:hAnsi="Consolas" w:cs="Consolas"/>
+          <w:sz w:val="16"/>
+          <w:szCs w:val="16"/>
+          <w:shd w:val="clear" w:color="auto" w:fill="FFFFFF"/>
+          <w:lang w:bidi="ar"/>
+        </w:rPr>
+        <w:t>createEvent</w:t>
+      </w:r>
+      <w:proofErr w:type="spellEnd"/>
+      <w:r>
+        <w:rPr>
+          <w:rStyle w:val="HTML"/>
+          <w:rFonts w:ascii="Consolas" w:eastAsia="Consolas" w:hAnsi="Consolas" w:cs="Consolas"/>
+          <w:sz w:val="16"/>
+          <w:szCs w:val="16"/>
+          <w:shd w:val="clear" w:color="auto" w:fill="FFFFFF"/>
+          <w:lang w:bidi="ar"/>
+        </w:rPr>
+        <w:t>(</w:t>
       </w:r>
       <w:proofErr w:type="gramEnd"/>
       <w:r>
         <w:rPr>
-          <w:rFonts w:ascii="Segoe UI" w:eastAsia="Segoe UI" w:hAnsi="Segoe UI" w:cs="Segoe UI"/>
-          <w:sz w:val="16"/>
-          <w:szCs w:val="16"/>
-          <w:shd w:val="clear" w:color="auto" w:fill="FFFFFF"/>
-          <w:lang w:bidi="ar"/>
-        </w:rPr>
-        <w:t xml:space="preserve"> be a part of multiple </w:t>
-      </w:r>
-      <w:proofErr w:type="spellStart"/>
-      <w:r>
-        <w:rPr>
-          <w:rStyle w:val="HTML"/>
-          <w:rFonts w:ascii="Consolas" w:eastAsia="Consolas" w:hAnsi="Consolas" w:cs="Consolas"/>
-          <w:sz w:val="16"/>
-          <w:szCs w:val="16"/>
-          <w:shd w:val="clear" w:color="auto" w:fill="FFFFFF"/>
-          <w:lang w:bidi="ar"/>
-        </w:rPr>
-        <w:t>StudentClub</w:t>
-      </w:r>
-      <w:r>
-        <w:rPr>
-          <w:rFonts w:ascii="Segoe UI" w:eastAsia="Segoe UI" w:hAnsi="Segoe UI" w:cs="Segoe UI"/>
-          <w:sz w:val="16"/>
-          <w:szCs w:val="16"/>
-          <w:shd w:val="clear" w:color="auto" w:fill="FFFFFF"/>
-          <w:lang w:bidi="ar"/>
-        </w:rPr>
-        <w:t>s</w:t>
-      </w:r>
-      <w:proofErr w:type="spellEnd"/>
-      <w:r>
-        <w:rPr>
-          <w:rFonts w:ascii="Segoe UI" w:eastAsia="Segoe UI" w:hAnsi="Segoe UI" w:cs="Segoe UI"/>
-          <w:sz w:val="16"/>
-          <w:szCs w:val="16"/>
-          <w:shd w:val="clear" w:color="auto" w:fill="FFFFFF"/>
-          <w:lang w:bidi="ar"/>
-        </w:rPr>
-        <w:t>, enabling them to engage in a diverse range of activities and interests. They can also RSVP to various </w:t>
-      </w:r>
-      <w:r>
-        <w:rPr>
-          <w:rStyle w:val="HTML"/>
-          <w:rFonts w:ascii="Consolas" w:eastAsia="Consolas" w:hAnsi="Consolas" w:cs="Consolas"/>
-          <w:sz w:val="16"/>
-          <w:szCs w:val="16"/>
-          <w:shd w:val="clear" w:color="auto" w:fill="FFFFFF"/>
-          <w:lang w:bidi="ar"/>
-        </w:rPr>
-        <w:t>Event</w:t>
-      </w:r>
-      <w:r>
-        <w:rPr>
-          <w:rFonts w:ascii="Segoe UI" w:eastAsia="Segoe UI" w:hAnsi="Segoe UI" w:cs="Segoe UI"/>
-          <w:sz w:val="16"/>
-          <w:szCs w:val="16"/>
-          <w:shd w:val="clear" w:color="auto" w:fill="FFFFFF"/>
-          <w:lang w:bidi="ar"/>
-        </w:rPr>
-        <w:t>s hosted by different clubs. The </w:t>
-      </w:r>
-      <w:proofErr w:type="spellStart"/>
-      <w:r>
-        <w:rPr>
-          <w:rStyle w:val="HTML"/>
-          <w:rFonts w:ascii="Consolas" w:eastAsia="Consolas" w:hAnsi="Consolas" w:cs="Consolas"/>
-          <w:sz w:val="16"/>
-          <w:szCs w:val="16"/>
-          <w:shd w:val="clear" w:color="auto" w:fill="FFFFFF"/>
-          <w:lang w:bidi="ar"/>
-        </w:rPr>
-        <w:t>viewEvents</w:t>
-      </w:r>
-      <w:proofErr w:type="spellEnd"/>
-      <w:r>
-        <w:rPr>
-          <w:rFonts w:ascii="Segoe UI" w:eastAsia="Segoe UI" w:hAnsi="Segoe UI" w:cs="Segoe UI"/>
-          <w:sz w:val="16"/>
-          <w:szCs w:val="16"/>
-          <w:shd w:val="clear" w:color="auto" w:fill="FFFFFF"/>
-          <w:lang w:bidi="ar"/>
-        </w:rPr>
-        <w:t> method allows a student to browse through a list of all the available events, providing them with details such as the event's title, description, venue, and date. The </w:t>
-      </w:r>
-      <w:proofErr w:type="spellStart"/>
-      <w:r>
-        <w:rPr>
-          <w:rStyle w:val="HTML"/>
-          <w:rFonts w:ascii="Consolas" w:eastAsia="Consolas" w:hAnsi="Consolas" w:cs="Consolas"/>
-          <w:sz w:val="16"/>
-          <w:szCs w:val="16"/>
-          <w:shd w:val="clear" w:color="auto" w:fill="FFFFFF"/>
-          <w:lang w:bidi="ar"/>
-        </w:rPr>
-        <w:t>rsvpEvent</w:t>
+          <w:rStyle w:val="HTML"/>
+          <w:rFonts w:ascii="Consolas" w:eastAsia="Consolas" w:hAnsi="Consolas" w:cs="Consolas"/>
+          <w:sz w:val="16"/>
+          <w:szCs w:val="16"/>
+          <w:shd w:val="clear" w:color="auto" w:fill="FFFFFF"/>
+          <w:lang w:bidi="ar"/>
+        </w:rPr>
+        <w:t>title, description, venue, capacity)</w:t>
+      </w:r>
+      <w:r>
+        <w:rPr>
+          <w:rFonts w:ascii="Segoe UI" w:eastAsia="Segoe UI" w:hAnsi="Segoe UI" w:cs="Segoe UI"/>
+          <w:sz w:val="16"/>
+          <w:szCs w:val="16"/>
+          <w:shd w:val="clear" w:color="auto" w:fill="FFFFFF"/>
+          <w:lang w:bidi="ar"/>
+        </w:rPr>
+        <w:t> method. This allows them to plan and schedule activities that cater to the interests of the club's members. The </w:t>
+      </w:r>
+      <w:proofErr w:type="spellStart"/>
+      <w:proofErr w:type="gramStart"/>
+      <w:r>
+        <w:rPr>
+          <w:rStyle w:val="HTML"/>
+          <w:rFonts w:ascii="Consolas" w:eastAsia="Consolas" w:hAnsi="Consolas" w:cs="Consolas"/>
+          <w:sz w:val="16"/>
+          <w:szCs w:val="16"/>
+          <w:shd w:val="clear" w:color="auto" w:fill="FFFFFF"/>
+          <w:lang w:bidi="ar"/>
+        </w:rPr>
+        <w:t>editEvent</w:t>
       </w:r>
       <w:proofErr w:type="spellEnd"/>
       <w:r>
@@ -1146,6 +1477,7 @@
         <w:t>(</w:t>
       </w:r>
       <w:proofErr w:type="spellStart"/>
+      <w:proofErr w:type="gramEnd"/>
       <w:r>
         <w:rPr>
           <w:rStyle w:val="HTML"/>
@@ -1167,6 +1499,64 @@
           <w:shd w:val="clear" w:color="auto" w:fill="FFFFFF"/>
           <w:lang w:bidi="ar"/>
         </w:rPr>
+        <w:t>, title, description, venue, capacity)</w:t>
+      </w:r>
+      <w:r>
+        <w:rPr>
+          <w:rFonts w:ascii="Segoe UI" w:eastAsia="Segoe UI" w:hAnsi="Segoe UI" w:cs="Segoe UI"/>
+          <w:sz w:val="16"/>
+          <w:szCs w:val="16"/>
+          <w:shd w:val="clear" w:color="auto" w:fill="FFFFFF"/>
+          <w:lang w:bidi="ar"/>
+        </w:rPr>
+        <w:t> method provides the flexibility to make changes to an event's details if necessary, while the </w:t>
+      </w:r>
+      <w:proofErr w:type="spellStart"/>
+      <w:r>
+        <w:rPr>
+          <w:rStyle w:val="HTML"/>
+          <w:rFonts w:ascii="Consolas" w:eastAsia="Consolas" w:hAnsi="Consolas" w:cs="Consolas"/>
+          <w:sz w:val="16"/>
+          <w:szCs w:val="16"/>
+          <w:shd w:val="clear" w:color="auto" w:fill="FFFFFF"/>
+          <w:lang w:bidi="ar"/>
+        </w:rPr>
+        <w:t>cancelEvent</w:t>
+      </w:r>
+      <w:proofErr w:type="spellEnd"/>
+      <w:r>
+        <w:rPr>
+          <w:rStyle w:val="HTML"/>
+          <w:rFonts w:ascii="Consolas" w:eastAsia="Consolas" w:hAnsi="Consolas" w:cs="Consolas"/>
+          <w:sz w:val="16"/>
+          <w:szCs w:val="16"/>
+          <w:shd w:val="clear" w:color="auto" w:fill="FFFFFF"/>
+          <w:lang w:bidi="ar"/>
+        </w:rPr>
+        <w:t>(</w:t>
+      </w:r>
+      <w:proofErr w:type="spellStart"/>
+      <w:r>
+        <w:rPr>
+          <w:rStyle w:val="HTML"/>
+          <w:rFonts w:ascii="Consolas" w:eastAsia="Consolas" w:hAnsi="Consolas" w:cs="Consolas"/>
+          <w:sz w:val="16"/>
+          <w:szCs w:val="16"/>
+          <w:shd w:val="clear" w:color="auto" w:fill="FFFFFF"/>
+          <w:lang w:bidi="ar"/>
+        </w:rPr>
+        <w:t>eventId</w:t>
+      </w:r>
+      <w:proofErr w:type="spellEnd"/>
+      <w:r>
+        <w:rPr>
+          <w:rStyle w:val="HTML"/>
+          <w:rFonts w:ascii="Consolas" w:eastAsia="Consolas" w:hAnsi="Consolas" w:cs="Consolas"/>
+          <w:sz w:val="16"/>
+          <w:szCs w:val="16"/>
+          <w:shd w:val="clear" w:color="auto" w:fill="FFFFFF"/>
+          <w:lang w:bidi="ar"/>
+        </w:rPr>
         <w:t>)</w:t>
       </w:r>
       <w:r>
@@ -1177,19 +1567,41 @@
           <w:shd w:val="clear" w:color="auto" w:fill="FFFFFF"/>
           <w:lang w:bidi="ar"/>
         </w:rPr>
-        <w:t> method enables a student to express their intention to attend an event by providing the unique identifier of the event. In case a student's plans change, the </w:t>
-      </w:r>
-      <w:proofErr w:type="spellStart"/>
-      <w:r>
-        <w:rPr>
-          <w:rStyle w:val="HTML"/>
-          <w:rFonts w:ascii="Consolas" w:eastAsia="Consolas" w:hAnsi="Consolas" w:cs="Consolas"/>
-          <w:sz w:val="16"/>
-          <w:szCs w:val="16"/>
-          <w:shd w:val="clear" w:color="auto" w:fill="FFFFFF"/>
-          <w:lang w:bidi="ar"/>
-        </w:rPr>
-        <w:t>cancelRSVP</w:t>
+        <w:t> method gives the option to cancel an event, perhaps due to unforeseen circumstances or low participation.</w:t>
+      </w:r>
+    </w:p>
+    <w:p/>
+    <w:p>
+      <w:pPr>
+        <w:shd w:val="clear" w:color="auto" w:fill="FFFFFF"/>
+        <w:rPr>
+          <w:rFonts w:ascii="Segoe UI" w:eastAsia="Segoe UI" w:hAnsi="Segoe UI" w:cs="Segoe UI"/>
+          <w:sz w:val="16"/>
+          <w:szCs w:val="16"/>
+        </w:rPr>
+      </w:pPr>
+      <w:r>
+        <w:rPr>
+          <w:rFonts w:ascii="Segoe UI" w:eastAsia="Segoe UI" w:hAnsi="Segoe UI" w:cs="Segoe UI"/>
+          <w:sz w:val="16"/>
+          <w:szCs w:val="16"/>
+          <w:shd w:val="clear" w:color="auto" w:fill="FFFFFF"/>
+          <w:lang w:bidi="ar"/>
+        </w:rPr>
+        <w:t>The club administrators also have the ability to manage other administrators within the club. The </w:t>
+      </w:r>
+      <w:proofErr w:type="spellStart"/>
+      <w:proofErr w:type="gramStart"/>
+      <w:r>
+        <w:rPr>
+          <w:rStyle w:val="HTML"/>
+          <w:rFonts w:ascii="Consolas" w:eastAsia="Consolas" w:hAnsi="Consolas" w:cs="Consolas"/>
+          <w:sz w:val="16"/>
+          <w:szCs w:val="16"/>
+          <w:shd w:val="clear" w:color="auto" w:fill="FFFFFF"/>
+          <w:lang w:bidi="ar"/>
+        </w:rPr>
+        <w:t>manageAdministrators</w:t>
       </w:r>
       <w:proofErr w:type="spellEnd"/>
       <w:r>
@@ -1204,16 +1616,251 @@
         <w:t>(</w:t>
       </w:r>
       <w:proofErr w:type="spellStart"/>
-      <w:r>
-        <w:rPr>
-          <w:rStyle w:val="HTML"/>
-          <w:rFonts w:ascii="Consolas" w:eastAsia="Consolas" w:hAnsi="Consolas" w:cs="Consolas"/>
-          <w:sz w:val="16"/>
-          <w:szCs w:val="16"/>
-          <w:shd w:val="clear" w:color="auto" w:fill="FFFFFF"/>
-          <w:lang w:bidi="ar"/>
-        </w:rPr>
-        <w:t>eventId</w:t>
+      <w:proofErr w:type="gramEnd"/>
+      <w:r>
+        <w:rPr>
+          <w:rStyle w:val="HTML"/>
+          <w:rFonts w:ascii="Consolas" w:eastAsia="Consolas" w:hAnsi="Consolas" w:cs="Consolas"/>
+          <w:sz w:val="16"/>
+          <w:szCs w:val="16"/>
+          <w:shd w:val="clear" w:color="auto" w:fill="FFFFFF"/>
+          <w:lang w:bidi="ar"/>
+        </w:rPr>
+        <w:t>studentId</w:t>
+      </w:r>
+      <w:proofErr w:type="spellEnd"/>
+      <w:r>
+        <w:rPr>
+          <w:rStyle w:val="HTML"/>
+          <w:rFonts w:ascii="Consolas" w:eastAsia="Consolas" w:hAnsi="Consolas" w:cs="Consolas"/>
+          <w:sz w:val="16"/>
+          <w:szCs w:val="16"/>
+          <w:shd w:val="clear" w:color="auto" w:fill="FFFFFF"/>
+          <w:lang w:bidi="ar"/>
+        </w:rPr>
+        <w:t>, action)</w:t>
+      </w:r>
+      <w:r>
+        <w:rPr>
+          <w:rFonts w:ascii="Segoe UI" w:eastAsia="Segoe UI" w:hAnsi="Segoe UI" w:cs="Segoe UI"/>
+          <w:sz w:val="16"/>
+          <w:szCs w:val="16"/>
+          <w:shd w:val="clear" w:color="auto" w:fill="FFFFFF"/>
+          <w:lang w:bidi="ar"/>
+        </w:rPr>
+        <w:t> method allows them to add or remove administrator privileges for other students in the club. Additionally, they can view all the funding applications related to their club using the </w:t>
+      </w:r>
+      <w:proofErr w:type="spellStart"/>
+      <w:r>
+        <w:rPr>
+          <w:rStyle w:val="HTML"/>
+          <w:rFonts w:ascii="Consolas" w:eastAsia="Consolas" w:hAnsi="Consolas" w:cs="Consolas"/>
+          <w:sz w:val="16"/>
+          <w:szCs w:val="16"/>
+          <w:shd w:val="clear" w:color="auto" w:fill="FFFFFF"/>
+          <w:lang w:bidi="ar"/>
+        </w:rPr>
+        <w:t>viewFundingApplications</w:t>
+      </w:r>
+      <w:proofErr w:type="spellEnd"/>
+      <w:r>
+        <w:rPr>
+          <w:rFonts w:ascii="Segoe UI" w:eastAsia="Segoe UI" w:hAnsi="Segoe UI" w:cs="Segoe UI"/>
+          <w:sz w:val="16"/>
+          <w:szCs w:val="16"/>
+          <w:shd w:val="clear" w:color="auto" w:fill="FFFFFF"/>
+          <w:lang w:bidi="ar"/>
+        </w:rPr>
+        <w:t> method, keeping track of the club's financial resources and potential for organizing events.</w:t>
+      </w:r>
+    </w:p>
+    <w:p/>
+    <w:p>
+      <w:pPr>
+        <w:shd w:val="clear" w:color="auto" w:fill="FFFFFF"/>
+        <w:rPr>
+          <w:rFonts w:ascii="Segoe UI" w:eastAsia="Segoe UI" w:hAnsi="Segoe UI" w:cs="Segoe UI"/>
+          <w:sz w:val="16"/>
+          <w:szCs w:val="16"/>
+        </w:rPr>
+      </w:pPr>
+      <w:proofErr w:type="spellStart"/>
+      <w:r>
+        <w:rPr>
+          <w:rStyle w:val="a4"/>
+          <w:rFonts w:ascii="Segoe UI" w:eastAsia="Segoe UI" w:hAnsi="Segoe UI" w:cs="Segoe UI"/>
+          <w:bCs/>
+          <w:sz w:val="16"/>
+          <w:szCs w:val="16"/>
+          <w:shd w:val="clear" w:color="auto" w:fill="FFFFFF"/>
+          <w:lang w:bidi="ar"/>
+        </w:rPr>
+        <w:t>FacultyAdministrator</w:t>
+      </w:r>
+      <w:proofErr w:type="spellEnd"/>
+    </w:p>
+    <w:p/>
+    <w:p>
+      <w:pPr>
+        <w:shd w:val="clear" w:color="auto" w:fill="FFFFFF"/>
+        <w:rPr>
+          <w:rFonts w:ascii="Segoe UI" w:eastAsia="Segoe UI" w:hAnsi="Segoe UI" w:cs="Segoe UI"/>
+          <w:sz w:val="16"/>
+          <w:szCs w:val="16"/>
+        </w:rPr>
+      </w:pPr>
+      <w:r>
+        <w:rPr>
+          <w:rFonts w:ascii="Segoe UI" w:eastAsia="Segoe UI" w:hAnsi="Segoe UI" w:cs="Segoe UI"/>
+          <w:sz w:val="16"/>
+          <w:szCs w:val="16"/>
+          <w:shd w:val="clear" w:color="auto" w:fill="FFFFFF"/>
+          <w:lang w:bidi="ar"/>
+        </w:rPr>
+        <w:t>The </w:t>
+      </w:r>
+      <w:proofErr w:type="spellStart"/>
+      <w:r>
+        <w:rPr>
+          <w:rStyle w:val="HTML"/>
+          <w:rFonts w:ascii="Consolas" w:eastAsia="Consolas" w:hAnsi="Consolas" w:cs="Consolas"/>
+          <w:sz w:val="16"/>
+          <w:szCs w:val="16"/>
+          <w:shd w:val="clear" w:color="auto" w:fill="FFFFFF"/>
+          <w:lang w:bidi="ar"/>
+        </w:rPr>
+        <w:t>FacultyAdministrator</w:t>
+      </w:r>
+      <w:proofErr w:type="spellEnd"/>
+      <w:r>
+        <w:rPr>
+          <w:rFonts w:ascii="Segoe UI" w:eastAsia="Segoe UI" w:hAnsi="Segoe UI" w:cs="Segoe UI"/>
+          <w:sz w:val="16"/>
+          <w:szCs w:val="16"/>
+          <w:shd w:val="clear" w:color="auto" w:fill="FFFFFF"/>
+          <w:lang w:bidi="ar"/>
+        </w:rPr>
+        <w:t> class represents the administrative staff at the faculty level. Their </w:t>
+      </w:r>
+      <w:r>
+        <w:rPr>
+          <w:rStyle w:val="HTML"/>
+          <w:rFonts w:ascii="Consolas" w:eastAsia="Consolas" w:hAnsi="Consolas" w:cs="Consolas"/>
+          <w:sz w:val="16"/>
+          <w:szCs w:val="16"/>
+          <w:shd w:val="clear" w:color="auto" w:fill="FFFFFF"/>
+          <w:lang w:bidi="ar"/>
+        </w:rPr>
+        <w:t>id</w:t>
+      </w:r>
+      <w:r>
+        <w:rPr>
+          <w:rFonts w:ascii="Segoe UI" w:eastAsia="Segoe UI" w:hAnsi="Segoe UI" w:cs="Segoe UI"/>
+          <w:sz w:val="16"/>
+          <w:szCs w:val="16"/>
+          <w:shd w:val="clear" w:color="auto" w:fill="FFFFFF"/>
+          <w:lang w:bidi="ar"/>
+        </w:rPr>
+        <w:t> uniquely identifies them within the system, and their </w:t>
+      </w:r>
+      <w:r>
+        <w:rPr>
+          <w:rStyle w:val="HTML"/>
+          <w:rFonts w:ascii="Consolas" w:eastAsia="Consolas" w:hAnsi="Consolas" w:cs="Consolas"/>
+          <w:sz w:val="16"/>
+          <w:szCs w:val="16"/>
+          <w:shd w:val="clear" w:color="auto" w:fill="FFFFFF"/>
+          <w:lang w:bidi="ar"/>
+        </w:rPr>
+        <w:t>name</w:t>
+      </w:r>
+      <w:r>
+        <w:rPr>
+          <w:rFonts w:ascii="Segoe UI" w:eastAsia="Segoe UI" w:hAnsi="Segoe UI" w:cs="Segoe UI"/>
+          <w:sz w:val="16"/>
+          <w:szCs w:val="16"/>
+          <w:shd w:val="clear" w:color="auto" w:fill="FFFFFF"/>
+          <w:lang w:bidi="ar"/>
+        </w:rPr>
+        <w:t> and </w:t>
+      </w:r>
+      <w:r>
+        <w:rPr>
+          <w:rStyle w:val="HTML"/>
+          <w:rFonts w:ascii="Consolas" w:eastAsia="Consolas" w:hAnsi="Consolas" w:cs="Consolas"/>
+          <w:sz w:val="16"/>
+          <w:szCs w:val="16"/>
+          <w:shd w:val="clear" w:color="auto" w:fill="FFFFFF"/>
+          <w:lang w:bidi="ar"/>
+        </w:rPr>
+        <w:t>email</w:t>
+      </w:r>
+      <w:r>
+        <w:rPr>
+          <w:rFonts w:ascii="Segoe UI" w:eastAsia="Segoe UI" w:hAnsi="Segoe UI" w:cs="Segoe UI"/>
+          <w:sz w:val="16"/>
+          <w:szCs w:val="16"/>
+          <w:shd w:val="clear" w:color="auto" w:fill="FFFFFF"/>
+          <w:lang w:bidi="ar"/>
+        </w:rPr>
+        <w:t> are essential for communication purposes.</w:t>
+      </w:r>
+    </w:p>
+    <w:p/>
+    <w:p>
+      <w:pPr>
+        <w:shd w:val="clear" w:color="auto" w:fill="FFFFFF"/>
+        <w:rPr>
+          <w:rFonts w:ascii="Segoe UI" w:eastAsia="Segoe UI" w:hAnsi="Segoe UI" w:cs="Segoe UI"/>
+          <w:sz w:val="16"/>
+          <w:szCs w:val="16"/>
+        </w:rPr>
+      </w:pPr>
+      <w:r>
+        <w:rPr>
+          <w:rFonts w:ascii="Segoe UI" w:eastAsia="Segoe UI" w:hAnsi="Segoe UI" w:cs="Segoe UI"/>
+          <w:sz w:val="16"/>
+          <w:szCs w:val="16"/>
+          <w:shd w:val="clear" w:color="auto" w:fill="FFFFFF"/>
+          <w:lang w:bidi="ar"/>
+        </w:rPr>
+        <w:t>Faculty administrators play a crucial role in the funding application process. They can review the funding applications submitted by the club administrators. The </w:t>
+      </w:r>
+      <w:proofErr w:type="spellStart"/>
+      <w:r>
+        <w:rPr>
+          <w:rStyle w:val="HTML"/>
+          <w:rFonts w:ascii="Consolas" w:eastAsia="Consolas" w:hAnsi="Consolas" w:cs="Consolas"/>
+          <w:sz w:val="16"/>
+          <w:szCs w:val="16"/>
+          <w:shd w:val="clear" w:color="auto" w:fill="FFFFFF"/>
+          <w:lang w:bidi="ar"/>
+        </w:rPr>
+        <w:t>approveApplication</w:t>
+      </w:r>
+      <w:proofErr w:type="spellEnd"/>
+      <w:r>
+        <w:rPr>
+          <w:rStyle w:val="HTML"/>
+          <w:rFonts w:ascii="Consolas" w:eastAsia="Consolas" w:hAnsi="Consolas" w:cs="Consolas"/>
+          <w:sz w:val="16"/>
+          <w:szCs w:val="16"/>
+          <w:shd w:val="clear" w:color="auto" w:fill="FFFFFF"/>
+          <w:lang w:bidi="ar"/>
+        </w:rPr>
+        <w:t>(</w:t>
+      </w:r>
+      <w:proofErr w:type="spellStart"/>
+      <w:r>
+        <w:rPr>
+          <w:rStyle w:val="HTML"/>
+          <w:rFonts w:ascii="Consolas" w:eastAsia="Consolas" w:hAnsi="Consolas" w:cs="Consolas"/>
+          <w:sz w:val="16"/>
+          <w:szCs w:val="16"/>
+          <w:shd w:val="clear" w:color="auto" w:fill="FFFFFF"/>
+          <w:lang w:bidi="ar"/>
+        </w:rPr>
+        <w:t>applicationId</w:t>
       </w:r>
       <w:proofErr w:type="spellEnd"/>
       <w:r>
@@ -1235,7 +1882,88 @@
           <w:shd w:val="clear" w:color="auto" w:fill="FFFFFF"/>
           <w:lang w:bidi="ar"/>
         </w:rPr>
-        <w:t> method allows them to withdraw their RSVP for a particular event, which in turn updates the available capacity for that event.</w:t>
+        <w:t> method allows them to give the green light to a funding application, while the </w:t>
+      </w:r>
+      <w:proofErr w:type="spellStart"/>
+      <w:r>
+        <w:rPr>
+          <w:rStyle w:val="HTML"/>
+          <w:rFonts w:ascii="Consolas" w:eastAsia="Consolas" w:hAnsi="Consolas" w:cs="Consolas"/>
+          <w:sz w:val="16"/>
+          <w:szCs w:val="16"/>
+          <w:shd w:val="clear" w:color="auto" w:fill="FFFFFF"/>
+          <w:lang w:bidi="ar"/>
+        </w:rPr>
+        <w:t>rejectApplication</w:t>
+      </w:r>
+      <w:proofErr w:type="spellEnd"/>
+      <w:r>
+        <w:rPr>
+          <w:rStyle w:val="HTML"/>
+          <w:rFonts w:ascii="Consolas" w:eastAsia="Consolas" w:hAnsi="Consolas" w:cs="Consolas"/>
+          <w:sz w:val="16"/>
+          <w:szCs w:val="16"/>
+          <w:shd w:val="clear" w:color="auto" w:fill="FFFFFF"/>
+          <w:lang w:bidi="ar"/>
+        </w:rPr>
+        <w:t>(</w:t>
+      </w:r>
+      <w:proofErr w:type="spellStart"/>
+      <w:r>
+        <w:rPr>
+          <w:rStyle w:val="HTML"/>
+          <w:rFonts w:ascii="Consolas" w:eastAsia="Consolas" w:hAnsi="Consolas" w:cs="Consolas"/>
+          <w:sz w:val="16"/>
+          <w:szCs w:val="16"/>
+          <w:shd w:val="clear" w:color="auto" w:fill="FFFFFF"/>
+          <w:lang w:bidi="ar"/>
+        </w:rPr>
+        <w:t>applicationId</w:t>
+      </w:r>
+      <w:proofErr w:type="spellEnd"/>
+      <w:r>
+        <w:rPr>
+          <w:rStyle w:val="HTML"/>
+          <w:rFonts w:ascii="Consolas" w:eastAsia="Consolas" w:hAnsi="Consolas" w:cs="Consolas"/>
+          <w:sz w:val="16"/>
+          <w:szCs w:val="16"/>
+          <w:shd w:val="clear" w:color="auto" w:fill="FFFFFF"/>
+          <w:lang w:bidi="ar"/>
+        </w:rPr>
+        <w:t>)</w:t>
+      </w:r>
+      <w:r>
+        <w:rPr>
+          <w:rFonts w:ascii="Segoe UI" w:eastAsia="Segoe UI" w:hAnsi="Segoe UI" w:cs="Segoe UI"/>
+          <w:sz w:val="16"/>
+          <w:szCs w:val="16"/>
+          <w:shd w:val="clear" w:color="auto" w:fill="FFFFFF"/>
+          <w:lang w:bidi="ar"/>
+        </w:rPr>
+        <w:t> method enables them to decline an application if it does not meet the necessary criteria. The </w:t>
+      </w:r>
+      <w:proofErr w:type="spellStart"/>
+      <w:r>
+        <w:rPr>
+          <w:rStyle w:val="HTML"/>
+          <w:rFonts w:ascii="Consolas" w:eastAsia="Consolas" w:hAnsi="Consolas" w:cs="Consolas"/>
+          <w:sz w:val="16"/>
+          <w:szCs w:val="16"/>
+          <w:shd w:val="clear" w:color="auto" w:fill="FFFFFF"/>
+          <w:lang w:bidi="ar"/>
+        </w:rPr>
+        <w:t>viewAllApplications</w:t>
+      </w:r>
+      <w:proofErr w:type="spellEnd"/>
+      <w:r>
+        <w:rPr>
+          <w:rFonts w:ascii="Segoe UI" w:eastAsia="Segoe UI" w:hAnsi="Segoe UI" w:cs="Segoe UI"/>
+          <w:sz w:val="16"/>
+          <w:szCs w:val="16"/>
+          <w:shd w:val="clear" w:color="auto" w:fill="FFFFFF"/>
+          <w:lang w:bidi="ar"/>
+        </w:rPr>
+        <w:t> method provides them with an overview of all the funding applications within the system, allowing them to manage and monitor the financial requests from different student clubs.</w:t>
       </w:r>
     </w:p>
     <w:p/>
@@ -1259,7 +1987,7 @@
           <w:shd w:val="clear" w:color="auto" w:fill="FFFFFF"/>
           <w:lang w:bidi="ar"/>
         </w:rPr>
-        <w:t>StudentClub</w:t>
+        <w:t>FundingApplication</w:t>
       </w:r>
       <w:proofErr w:type="spellEnd"/>
     </w:p>
@@ -1293,18 +2021,18 @@
           <w:shd w:val="clear" w:color="auto" w:fill="FFFFFF"/>
           <w:lang w:bidi="ar"/>
         </w:rPr>
-        <w:t>StudentClub</w:t>
-      </w:r>
-      <w:proofErr w:type="spellEnd"/>
-      <w:r>
-        <w:rPr>
-          <w:rFonts w:ascii="Segoe UI" w:eastAsia="Segoe UI" w:hAnsi="Segoe UI" w:cs="Segoe UI"/>
-          <w:sz w:val="16"/>
-          <w:szCs w:val="16"/>
-          <w:shd w:val="clear" w:color="auto" w:fill="FFFFFF"/>
-          <w:lang w:bidi="ar"/>
-        </w:rPr>
-        <w:t> class represents the various clubs that exist within the university. Each club has a unique </w:t>
+        <w:t>FundingApplication</w:t>
+      </w:r>
+      <w:proofErr w:type="spellEnd"/>
+      <w:r>
+        <w:rPr>
+          <w:rFonts w:ascii="Segoe UI" w:eastAsia="Segoe UI" w:hAnsi="Segoe UI" w:cs="Segoe UI"/>
+          <w:sz w:val="16"/>
+          <w:szCs w:val="16"/>
+          <w:shd w:val="clear" w:color="auto" w:fill="FFFFFF"/>
+          <w:lang w:bidi="ar"/>
+        </w:rPr>
+        <w:t> class is central to the financial aspect of the student clubs' activities. It stores important information about each funding application. The </w:t>
       </w:r>
       <w:r>
         <w:rPr>
@@ -1325,28 +2053,7 @@
           <w:shd w:val="clear" w:color="auto" w:fill="FFFFFF"/>
           <w:lang w:bidi="ar"/>
         </w:rPr>
-        <w:t> for identification, a distinct </w:t>
-      </w:r>
-      <w:r>
-        <w:rPr>
-          <w:rStyle w:val="HTML"/>
-          <w:rFonts w:ascii="Consolas" w:eastAsia="Consolas" w:hAnsi="Consolas" w:cs="Consolas"/>
-          <w:sz w:val="16"/>
-          <w:szCs w:val="16"/>
-          <w:shd w:val="clear" w:color="auto" w:fill="FFFFFF"/>
-          <w:lang w:bidi="ar"/>
-        </w:rPr>
-        <w:t>name</w:t>
-      </w:r>
-      <w:r>
-        <w:rPr>
-          <w:rFonts w:ascii="Segoe UI" w:eastAsia="Segoe UI" w:hAnsi="Segoe UI" w:cs="Segoe UI"/>
-          <w:sz w:val="16"/>
-          <w:szCs w:val="16"/>
-          <w:shd w:val="clear" w:color="auto" w:fill="FFFFFF"/>
-          <w:lang w:bidi="ar"/>
-        </w:rPr>
-        <w:t> that reflects its nature or theme, and a </w:t>
+        <w:t> provides a unique identification for each application. The </w:t>
       </w:r>
       <w:r>
         <w:rPr>
@@ -1367,7 +2074,51 @@
           <w:shd w:val="clear" w:color="auto" w:fill="FFFFFF"/>
           <w:lang w:bidi="ar"/>
         </w:rPr>
-        <w:t> that gives potential members and others an understanding of the club's goals and activities.</w:t>
+        <w:t> details how the funds will be used, whether it's for event supplies, guest speakers, or other club-related expenses. The </w:t>
+      </w:r>
+      <w:proofErr w:type="spellStart"/>
+      <w:r>
+        <w:rPr>
+          <w:rStyle w:val="HTML"/>
+          <w:rFonts w:ascii="Consolas" w:eastAsia="Consolas" w:hAnsi="Consolas" w:cs="Consolas"/>
+          <w:sz w:val="16"/>
+          <w:szCs w:val="16"/>
+          <w:shd w:val="clear" w:color="auto" w:fill="FFFFFF"/>
+          <w:lang w:bidi="ar"/>
+        </w:rPr>
+        <w:t>amountRequested</w:t>
+      </w:r>
+      <w:proofErr w:type="spellEnd"/>
+      <w:r>
+        <w:rPr>
+          <w:rFonts w:ascii="Segoe UI" w:eastAsia="Segoe UI" w:hAnsi="Segoe UI" w:cs="Segoe UI"/>
+          <w:sz w:val="16"/>
+          <w:szCs w:val="16"/>
+          <w:shd w:val="clear" w:color="auto" w:fill="FFFFFF"/>
+          <w:lang w:bidi="ar"/>
+        </w:rPr>
+        <w:t> indicates the specific sum of money the student club is seeking to support their activities for the semester. The </w:t>
+      </w:r>
+      <w:r>
+        <w:rPr>
+          <w:rStyle w:val="HTML"/>
+          <w:rFonts w:ascii="Consolas" w:eastAsia="Consolas" w:hAnsi="Consolas" w:cs="Consolas"/>
+          <w:sz w:val="16"/>
+          <w:szCs w:val="16"/>
+          <w:shd w:val="clear" w:color="auto" w:fill="FFFFFF"/>
+          <w:lang w:bidi="ar"/>
+        </w:rPr>
+        <w:t>status</w:t>
+      </w:r>
+      <w:r>
+        <w:rPr>
+          <w:rFonts w:ascii="Segoe UI" w:eastAsia="Segoe UI" w:hAnsi="Segoe UI" w:cs="Segoe UI"/>
+          <w:sz w:val="16"/>
+          <w:szCs w:val="16"/>
+          <w:shd w:val="clear" w:color="auto" w:fill="FFFFFF"/>
+          <w:lang w:bidi="ar"/>
+        </w:rPr>
+        <w:t> reflects the current stage of the application, whether it's in draft, submitted, in review, approved, or rejected.</w:t>
       </w:r>
     </w:p>
     <w:p/>
@@ -1388,7 +2139,7 @@
           <w:shd w:val="clear" w:color="auto" w:fill="FFFFFF"/>
           <w:lang w:bidi="ar"/>
         </w:rPr>
-        <w:t>The administrators of a student club have the power to organize events through the </w:t>
+        <w:t>Club administrators can create a new funding application using the </w:t>
       </w:r>
       <w:proofErr w:type="spellStart"/>
       <w:proofErr w:type="gramStart"/>
@@ -1401,7 +2152,7 @@
           <w:shd w:val="clear" w:color="auto" w:fill="FFFFFF"/>
           <w:lang w:bidi="ar"/>
         </w:rPr>
-        <w:t>createEvent</w:t>
+        <w:t>createApplication</w:t>
       </w:r>
       <w:proofErr w:type="spellEnd"/>
       <w:r>
@@ -1425,17 +2176,41 @@
           <w:shd w:val="clear" w:color="auto" w:fill="FFFFFF"/>
           <w:lang w:bidi="ar"/>
         </w:rPr>
-        <w:t>title, description, venue, capacity)</w:t>
-      </w:r>
-      <w:r>
-        <w:rPr>
-          <w:rFonts w:ascii="Segoe UI" w:eastAsia="Segoe UI" w:hAnsi="Segoe UI" w:cs="Segoe UI"/>
-          <w:sz w:val="16"/>
-          <w:szCs w:val="16"/>
-          <w:shd w:val="clear" w:color="auto" w:fill="FFFFFF"/>
-          <w:lang w:bidi="ar"/>
-        </w:rPr>
-        <w:t> method. This allows them to plan and schedule activities that cater to the interests of the club's members. The </w:t>
+        <w:t xml:space="preserve">description, </w:t>
+      </w:r>
+      <w:proofErr w:type="spellStart"/>
+      <w:r>
+        <w:rPr>
+          <w:rStyle w:val="HTML"/>
+          <w:rFonts w:ascii="Consolas" w:eastAsia="Consolas" w:hAnsi="Consolas" w:cs="Consolas"/>
+          <w:sz w:val="16"/>
+          <w:szCs w:val="16"/>
+          <w:shd w:val="clear" w:color="auto" w:fill="FFFFFF"/>
+          <w:lang w:bidi="ar"/>
+        </w:rPr>
+        <w:t>amountRequested</w:t>
+      </w:r>
+      <w:proofErr w:type="spellEnd"/>
+      <w:r>
+        <w:rPr>
+          <w:rStyle w:val="HTML"/>
+          <w:rFonts w:ascii="Consolas" w:eastAsia="Consolas" w:hAnsi="Consolas" w:cs="Consolas"/>
+          <w:sz w:val="16"/>
+          <w:szCs w:val="16"/>
+          <w:shd w:val="clear" w:color="auto" w:fill="FFFFFF"/>
+          <w:lang w:bidi="ar"/>
+        </w:rPr>
+        <w:t>)</w:t>
+      </w:r>
+      <w:r>
+        <w:rPr>
+          <w:rFonts w:ascii="Segoe UI" w:eastAsia="Segoe UI" w:hAnsi="Segoe UI" w:cs="Segoe UI"/>
+          <w:sz w:val="16"/>
+          <w:szCs w:val="16"/>
+          <w:shd w:val="clear" w:color="auto" w:fill="FFFFFF"/>
+          <w:lang w:bidi="ar"/>
+        </w:rPr>
+        <w:t> method. If there are changes needed, they can use the </w:t>
       </w:r>
       <w:proofErr w:type="spellStart"/>
       <w:proofErr w:type="gramStart"/>
@@ -1448,7 +2223,7 @@
           <w:shd w:val="clear" w:color="auto" w:fill="FFFFFF"/>
           <w:lang w:bidi="ar"/>
         </w:rPr>
-        <w:t>editEvent</w:t>
+        <w:t>editApplication</w:t>
       </w:r>
       <w:proofErr w:type="spellEnd"/>
       <w:r>
@@ -1473,41 +2248,65 @@
           <w:shd w:val="clear" w:color="auto" w:fill="FFFFFF"/>
           <w:lang w:bidi="ar"/>
         </w:rPr>
-        <w:t>eventId</w:t>
-      </w:r>
-      <w:proofErr w:type="spellEnd"/>
-      <w:r>
-        <w:rPr>
-          <w:rStyle w:val="HTML"/>
-          <w:rFonts w:ascii="Consolas" w:eastAsia="Consolas" w:hAnsi="Consolas" w:cs="Consolas"/>
-          <w:sz w:val="16"/>
-          <w:szCs w:val="16"/>
-          <w:shd w:val="clear" w:color="auto" w:fill="FFFFFF"/>
-          <w:lang w:bidi="ar"/>
-        </w:rPr>
-        <w:t>, title, description, venue, capacity)</w:t>
-      </w:r>
-      <w:r>
-        <w:rPr>
-          <w:rFonts w:ascii="Segoe UI" w:eastAsia="Segoe UI" w:hAnsi="Segoe UI" w:cs="Segoe UI"/>
-          <w:sz w:val="16"/>
-          <w:szCs w:val="16"/>
-          <w:shd w:val="clear" w:color="auto" w:fill="FFFFFF"/>
-          <w:lang w:bidi="ar"/>
-        </w:rPr>
-        <w:t> method provides the flexibility to make changes to an event's details if necessary, while the </w:t>
-      </w:r>
-      <w:proofErr w:type="spellStart"/>
-      <w:r>
-        <w:rPr>
-          <w:rStyle w:val="HTML"/>
-          <w:rFonts w:ascii="Consolas" w:eastAsia="Consolas" w:hAnsi="Consolas" w:cs="Consolas"/>
-          <w:sz w:val="16"/>
-          <w:szCs w:val="16"/>
-          <w:shd w:val="clear" w:color="auto" w:fill="FFFFFF"/>
-          <w:lang w:bidi="ar"/>
-        </w:rPr>
-        <w:t>cancelEvent</w:t>
+        <w:t>applicationId</w:t>
+      </w:r>
+      <w:proofErr w:type="spellEnd"/>
+      <w:r>
+        <w:rPr>
+          <w:rStyle w:val="HTML"/>
+          <w:rFonts w:ascii="Consolas" w:eastAsia="Consolas" w:hAnsi="Consolas" w:cs="Consolas"/>
+          <w:sz w:val="16"/>
+          <w:szCs w:val="16"/>
+          <w:shd w:val="clear" w:color="auto" w:fill="FFFFFF"/>
+          <w:lang w:bidi="ar"/>
+        </w:rPr>
+        <w:t xml:space="preserve">, </w:t>
+      </w:r>
+      <w:proofErr w:type="spellStart"/>
+      <w:r>
+        <w:rPr>
+          <w:rStyle w:val="HTML"/>
+          <w:rFonts w:ascii="Consolas" w:eastAsia="Consolas" w:hAnsi="Consolas" w:cs="Consolas"/>
+          <w:sz w:val="16"/>
+          <w:szCs w:val="16"/>
+          <w:shd w:val="clear" w:color="auto" w:fill="FFFFFF"/>
+          <w:lang w:bidi="ar"/>
+        </w:rPr>
+        <w:t>newDetails</w:t>
+      </w:r>
+      <w:proofErr w:type="spellEnd"/>
+      <w:r>
+        <w:rPr>
+          <w:rStyle w:val="HTML"/>
+          <w:rFonts w:ascii="Consolas" w:eastAsia="Consolas" w:hAnsi="Consolas" w:cs="Consolas"/>
+          <w:sz w:val="16"/>
+          <w:szCs w:val="16"/>
+          <w:shd w:val="clear" w:color="auto" w:fill="FFFFFF"/>
+          <w:lang w:bidi="ar"/>
+        </w:rPr>
+        <w:t>)</w:t>
+      </w:r>
+      <w:r>
+        <w:rPr>
+          <w:rFonts w:ascii="Segoe UI" w:eastAsia="Segoe UI" w:hAnsi="Segoe UI" w:cs="Segoe UI"/>
+          <w:sz w:val="16"/>
+          <w:szCs w:val="16"/>
+          <w:shd w:val="clear" w:color="auto" w:fill="FFFFFF"/>
+          <w:lang w:bidi="ar"/>
+        </w:rPr>
+        <w:t> method to update the application. In case they decide to withdraw the application, the </w:t>
+      </w:r>
+      <w:proofErr w:type="spellStart"/>
+      <w:r>
+        <w:rPr>
+          <w:rStyle w:val="HTML"/>
+          <w:rFonts w:ascii="Consolas" w:eastAsia="Consolas" w:hAnsi="Consolas" w:cs="Consolas"/>
+          <w:sz w:val="16"/>
+          <w:szCs w:val="16"/>
+          <w:shd w:val="clear" w:color="auto" w:fill="FFFFFF"/>
+          <w:lang w:bidi="ar"/>
+        </w:rPr>
+        <w:t>cancelApplication</w:t>
       </w:r>
       <w:proofErr w:type="spellEnd"/>
       <w:r>
@@ -1531,7 +2330,7 @@
           <w:shd w:val="clear" w:color="auto" w:fill="FFFFFF"/>
           <w:lang w:bidi="ar"/>
         </w:rPr>
-        <w:t>eventId</w:t>
+        <w:t>applicationId</w:t>
       </w:r>
       <w:proofErr w:type="spellEnd"/>
       <w:r>
@@ -1553,813 +2352,6 @@
           <w:shd w:val="clear" w:color="auto" w:fill="FFFFFF"/>
           <w:lang w:bidi="ar"/>
         </w:rPr>
-        <w:t> method gives the option to cancel an event, perhaps due to unforeseen circumstances or low participation.</w:t>
-      </w:r>
-    </w:p>
-    <w:p/>
-    <w:p>
-      <w:pPr>
-        <w:shd w:val="clear" w:color="auto" w:fill="FFFFFF"/>
-        <w:rPr>
-          <w:rFonts w:ascii="Segoe UI" w:eastAsia="Segoe UI" w:hAnsi="Segoe UI" w:cs="Segoe UI"/>
-          <w:sz w:val="16"/>
-          <w:szCs w:val="16"/>
-        </w:rPr>
-      </w:pPr>
-      <w:r>
-        <w:rPr>
-          <w:rFonts w:ascii="Segoe UI" w:eastAsia="Segoe UI" w:hAnsi="Segoe UI" w:cs="Segoe UI"/>
-          <w:sz w:val="16"/>
-          <w:szCs w:val="16"/>
-          <w:shd w:val="clear" w:color="auto" w:fill="FFFFFF"/>
-          <w:lang w:bidi="ar"/>
-        </w:rPr>
-        <w:t xml:space="preserve">The club administrators also </w:t>
-      </w:r>
-      <w:proofErr w:type="gramStart"/>
-      <w:r>
-        <w:rPr>
-          <w:rFonts w:ascii="Segoe UI" w:eastAsia="Segoe UI" w:hAnsi="Segoe UI" w:cs="Segoe UI"/>
-          <w:sz w:val="16"/>
-          <w:szCs w:val="16"/>
-          <w:shd w:val="clear" w:color="auto" w:fill="FFFFFF"/>
-          <w:lang w:bidi="ar"/>
-        </w:rPr>
-        <w:t>have the ability to</w:t>
-      </w:r>
-      <w:proofErr w:type="gramEnd"/>
-      <w:r>
-        <w:rPr>
-          <w:rFonts w:ascii="Segoe UI" w:eastAsia="Segoe UI" w:hAnsi="Segoe UI" w:cs="Segoe UI"/>
-          <w:sz w:val="16"/>
-          <w:szCs w:val="16"/>
-          <w:shd w:val="clear" w:color="auto" w:fill="FFFFFF"/>
-          <w:lang w:bidi="ar"/>
-        </w:rPr>
-        <w:t xml:space="preserve"> manage other administrators within the club. The </w:t>
-      </w:r>
-      <w:proofErr w:type="spellStart"/>
-      <w:proofErr w:type="gramStart"/>
-      <w:r>
-        <w:rPr>
-          <w:rStyle w:val="HTML"/>
-          <w:rFonts w:ascii="Consolas" w:eastAsia="Consolas" w:hAnsi="Consolas" w:cs="Consolas"/>
-          <w:sz w:val="16"/>
-          <w:szCs w:val="16"/>
-          <w:shd w:val="clear" w:color="auto" w:fill="FFFFFF"/>
-          <w:lang w:bidi="ar"/>
-        </w:rPr>
-        <w:t>manageAdministrators</w:t>
-      </w:r>
-      <w:proofErr w:type="spellEnd"/>
-      <w:r>
-        <w:rPr>
-          <w:rStyle w:val="HTML"/>
-          <w:rFonts w:ascii="Consolas" w:eastAsia="Consolas" w:hAnsi="Consolas" w:cs="Consolas"/>
-          <w:sz w:val="16"/>
-          <w:szCs w:val="16"/>
-          <w:shd w:val="clear" w:color="auto" w:fill="FFFFFF"/>
-          <w:lang w:bidi="ar"/>
-        </w:rPr>
-        <w:t>(</w:t>
-      </w:r>
-      <w:proofErr w:type="spellStart"/>
-      <w:proofErr w:type="gramEnd"/>
-      <w:r>
-        <w:rPr>
-          <w:rStyle w:val="HTML"/>
-          <w:rFonts w:ascii="Consolas" w:eastAsia="Consolas" w:hAnsi="Consolas" w:cs="Consolas"/>
-          <w:sz w:val="16"/>
-          <w:szCs w:val="16"/>
-          <w:shd w:val="clear" w:color="auto" w:fill="FFFFFF"/>
-          <w:lang w:bidi="ar"/>
-        </w:rPr>
-        <w:t>studentId</w:t>
-      </w:r>
-      <w:proofErr w:type="spellEnd"/>
-      <w:r>
-        <w:rPr>
-          <w:rStyle w:val="HTML"/>
-          <w:rFonts w:ascii="Consolas" w:eastAsia="Consolas" w:hAnsi="Consolas" w:cs="Consolas"/>
-          <w:sz w:val="16"/>
-          <w:szCs w:val="16"/>
-          <w:shd w:val="clear" w:color="auto" w:fill="FFFFFF"/>
-          <w:lang w:bidi="ar"/>
-        </w:rPr>
-        <w:t>, action)</w:t>
-      </w:r>
-      <w:r>
-        <w:rPr>
-          <w:rFonts w:ascii="Segoe UI" w:eastAsia="Segoe UI" w:hAnsi="Segoe UI" w:cs="Segoe UI"/>
-          <w:sz w:val="16"/>
-          <w:szCs w:val="16"/>
-          <w:shd w:val="clear" w:color="auto" w:fill="FFFFFF"/>
-          <w:lang w:bidi="ar"/>
-        </w:rPr>
-        <w:t> method allows them to add or remove administrator privileges for other students in the club. Additionally, they can view all the funding applications related to their club using the </w:t>
-      </w:r>
-      <w:proofErr w:type="spellStart"/>
-      <w:r>
-        <w:rPr>
-          <w:rStyle w:val="HTML"/>
-          <w:rFonts w:ascii="Consolas" w:eastAsia="Consolas" w:hAnsi="Consolas" w:cs="Consolas"/>
-          <w:sz w:val="16"/>
-          <w:szCs w:val="16"/>
-          <w:shd w:val="clear" w:color="auto" w:fill="FFFFFF"/>
-          <w:lang w:bidi="ar"/>
-        </w:rPr>
-        <w:t>viewFundingApplications</w:t>
-      </w:r>
-      <w:proofErr w:type="spellEnd"/>
-      <w:r>
-        <w:rPr>
-          <w:rFonts w:ascii="Segoe UI" w:eastAsia="Segoe UI" w:hAnsi="Segoe UI" w:cs="Segoe UI"/>
-          <w:sz w:val="16"/>
-          <w:szCs w:val="16"/>
-          <w:shd w:val="clear" w:color="auto" w:fill="FFFFFF"/>
-          <w:lang w:bidi="ar"/>
-        </w:rPr>
-        <w:t> method, keeping track of the club's financial resources and potential for organizing events.</w:t>
-      </w:r>
-    </w:p>
-    <w:p/>
-    <w:p>
-      <w:pPr>
-        <w:shd w:val="clear" w:color="auto" w:fill="FFFFFF"/>
-        <w:rPr>
-          <w:rFonts w:ascii="Segoe UI" w:eastAsia="Segoe UI" w:hAnsi="Segoe UI" w:cs="Segoe UI"/>
-          <w:sz w:val="16"/>
-          <w:szCs w:val="16"/>
-        </w:rPr>
-      </w:pPr>
-      <w:proofErr w:type="spellStart"/>
-      <w:r>
-        <w:rPr>
-          <w:rStyle w:val="a4"/>
-          <w:rFonts w:ascii="Segoe UI" w:eastAsia="Segoe UI" w:hAnsi="Segoe UI" w:cs="Segoe UI"/>
-          <w:bCs/>
-          <w:sz w:val="16"/>
-          <w:szCs w:val="16"/>
-          <w:shd w:val="clear" w:color="auto" w:fill="FFFFFF"/>
-          <w:lang w:bidi="ar"/>
-        </w:rPr>
-        <w:t>FacultyAdministrator</w:t>
-      </w:r>
-      <w:proofErr w:type="spellEnd"/>
-    </w:p>
-    <w:p/>
-    <w:p>
-      <w:pPr>
-        <w:shd w:val="clear" w:color="auto" w:fill="FFFFFF"/>
-        <w:rPr>
-          <w:rFonts w:ascii="Segoe UI" w:eastAsia="Segoe UI" w:hAnsi="Segoe UI" w:cs="Segoe UI"/>
-          <w:sz w:val="16"/>
-          <w:szCs w:val="16"/>
-        </w:rPr>
-      </w:pPr>
-      <w:r>
-        <w:rPr>
-          <w:rFonts w:ascii="Segoe UI" w:eastAsia="Segoe UI" w:hAnsi="Segoe UI" w:cs="Segoe UI"/>
-          <w:sz w:val="16"/>
-          <w:szCs w:val="16"/>
-          <w:shd w:val="clear" w:color="auto" w:fill="FFFFFF"/>
-          <w:lang w:bidi="ar"/>
-        </w:rPr>
-        <w:t>The </w:t>
-      </w:r>
-      <w:proofErr w:type="spellStart"/>
-      <w:r>
-        <w:rPr>
-          <w:rStyle w:val="HTML"/>
-          <w:rFonts w:ascii="Consolas" w:eastAsia="Consolas" w:hAnsi="Consolas" w:cs="Consolas"/>
-          <w:sz w:val="16"/>
-          <w:szCs w:val="16"/>
-          <w:shd w:val="clear" w:color="auto" w:fill="FFFFFF"/>
-          <w:lang w:bidi="ar"/>
-        </w:rPr>
-        <w:t>FacultyAdministrator</w:t>
-      </w:r>
-      <w:proofErr w:type="spellEnd"/>
-      <w:r>
-        <w:rPr>
-          <w:rFonts w:ascii="Segoe UI" w:eastAsia="Segoe UI" w:hAnsi="Segoe UI" w:cs="Segoe UI"/>
-          <w:sz w:val="16"/>
-          <w:szCs w:val="16"/>
-          <w:shd w:val="clear" w:color="auto" w:fill="FFFFFF"/>
-          <w:lang w:bidi="ar"/>
-        </w:rPr>
-        <w:t> class represents the administrative staff at the faculty level. Their </w:t>
-      </w:r>
-      <w:r>
-        <w:rPr>
-          <w:rStyle w:val="HTML"/>
-          <w:rFonts w:ascii="Consolas" w:eastAsia="Consolas" w:hAnsi="Consolas" w:cs="Consolas"/>
-          <w:sz w:val="16"/>
-          <w:szCs w:val="16"/>
-          <w:shd w:val="clear" w:color="auto" w:fill="FFFFFF"/>
-          <w:lang w:bidi="ar"/>
-        </w:rPr>
-        <w:t>id</w:t>
-      </w:r>
-      <w:r>
-        <w:rPr>
-          <w:rFonts w:ascii="Segoe UI" w:eastAsia="Segoe UI" w:hAnsi="Segoe UI" w:cs="Segoe UI"/>
-          <w:sz w:val="16"/>
-          <w:szCs w:val="16"/>
-          <w:shd w:val="clear" w:color="auto" w:fill="FFFFFF"/>
-          <w:lang w:bidi="ar"/>
-        </w:rPr>
-        <w:t> uniquely identifies them within the system, and their </w:t>
-      </w:r>
-      <w:r>
-        <w:rPr>
-          <w:rStyle w:val="HTML"/>
-          <w:rFonts w:ascii="Consolas" w:eastAsia="Consolas" w:hAnsi="Consolas" w:cs="Consolas"/>
-          <w:sz w:val="16"/>
-          <w:szCs w:val="16"/>
-          <w:shd w:val="clear" w:color="auto" w:fill="FFFFFF"/>
-          <w:lang w:bidi="ar"/>
-        </w:rPr>
-        <w:t>name</w:t>
-      </w:r>
-      <w:r>
-        <w:rPr>
-          <w:rFonts w:ascii="Segoe UI" w:eastAsia="Segoe UI" w:hAnsi="Segoe UI" w:cs="Segoe UI"/>
-          <w:sz w:val="16"/>
-          <w:szCs w:val="16"/>
-          <w:shd w:val="clear" w:color="auto" w:fill="FFFFFF"/>
-          <w:lang w:bidi="ar"/>
-        </w:rPr>
-        <w:t> and </w:t>
-      </w:r>
-      <w:r>
-        <w:rPr>
-          <w:rStyle w:val="HTML"/>
-          <w:rFonts w:ascii="Consolas" w:eastAsia="Consolas" w:hAnsi="Consolas" w:cs="Consolas"/>
-          <w:sz w:val="16"/>
-          <w:szCs w:val="16"/>
-          <w:shd w:val="clear" w:color="auto" w:fill="FFFFFF"/>
-          <w:lang w:bidi="ar"/>
-        </w:rPr>
-        <w:t>email</w:t>
-      </w:r>
-      <w:r>
-        <w:rPr>
-          <w:rFonts w:ascii="Segoe UI" w:eastAsia="Segoe UI" w:hAnsi="Segoe UI" w:cs="Segoe UI"/>
-          <w:sz w:val="16"/>
-          <w:szCs w:val="16"/>
-          <w:shd w:val="clear" w:color="auto" w:fill="FFFFFF"/>
-          <w:lang w:bidi="ar"/>
-        </w:rPr>
-        <w:t> are essential for communication purposes.</w:t>
-      </w:r>
-    </w:p>
-    <w:p/>
-    <w:p>
-      <w:pPr>
-        <w:shd w:val="clear" w:color="auto" w:fill="FFFFFF"/>
-        <w:rPr>
-          <w:rFonts w:ascii="Segoe UI" w:eastAsia="Segoe UI" w:hAnsi="Segoe UI" w:cs="Segoe UI"/>
-          <w:sz w:val="16"/>
-          <w:szCs w:val="16"/>
-        </w:rPr>
-      </w:pPr>
-      <w:r>
-        <w:rPr>
-          <w:rFonts w:ascii="Segoe UI" w:eastAsia="Segoe UI" w:hAnsi="Segoe UI" w:cs="Segoe UI"/>
-          <w:sz w:val="16"/>
-          <w:szCs w:val="16"/>
-          <w:shd w:val="clear" w:color="auto" w:fill="FFFFFF"/>
-          <w:lang w:bidi="ar"/>
-        </w:rPr>
-        <w:t>Faculty administrators play a crucial role in the funding application process. They can review the funding applications submitted by the club administrators. The </w:t>
-      </w:r>
-      <w:proofErr w:type="spellStart"/>
-      <w:r>
-        <w:rPr>
-          <w:rStyle w:val="HTML"/>
-          <w:rFonts w:ascii="Consolas" w:eastAsia="Consolas" w:hAnsi="Consolas" w:cs="Consolas"/>
-          <w:sz w:val="16"/>
-          <w:szCs w:val="16"/>
-          <w:shd w:val="clear" w:color="auto" w:fill="FFFFFF"/>
-          <w:lang w:bidi="ar"/>
-        </w:rPr>
-        <w:t>approveApplication</w:t>
-      </w:r>
-      <w:proofErr w:type="spellEnd"/>
-      <w:r>
-        <w:rPr>
-          <w:rStyle w:val="HTML"/>
-          <w:rFonts w:ascii="Consolas" w:eastAsia="Consolas" w:hAnsi="Consolas" w:cs="Consolas"/>
-          <w:sz w:val="16"/>
-          <w:szCs w:val="16"/>
-          <w:shd w:val="clear" w:color="auto" w:fill="FFFFFF"/>
-          <w:lang w:bidi="ar"/>
-        </w:rPr>
-        <w:t>(</w:t>
-      </w:r>
-      <w:proofErr w:type="spellStart"/>
-      <w:r>
-        <w:rPr>
-          <w:rStyle w:val="HTML"/>
-          <w:rFonts w:ascii="Consolas" w:eastAsia="Consolas" w:hAnsi="Consolas" w:cs="Consolas"/>
-          <w:sz w:val="16"/>
-          <w:szCs w:val="16"/>
-          <w:shd w:val="clear" w:color="auto" w:fill="FFFFFF"/>
-          <w:lang w:bidi="ar"/>
-        </w:rPr>
-        <w:t>applicationId</w:t>
-      </w:r>
-      <w:proofErr w:type="spellEnd"/>
-      <w:r>
-        <w:rPr>
-          <w:rStyle w:val="HTML"/>
-          <w:rFonts w:ascii="Consolas" w:eastAsia="Consolas" w:hAnsi="Consolas" w:cs="Consolas"/>
-          <w:sz w:val="16"/>
-          <w:szCs w:val="16"/>
-          <w:shd w:val="clear" w:color="auto" w:fill="FFFFFF"/>
-          <w:lang w:bidi="ar"/>
-        </w:rPr>
-        <w:t>)</w:t>
-      </w:r>
-      <w:r>
-        <w:rPr>
-          <w:rFonts w:ascii="Segoe UI" w:eastAsia="Segoe UI" w:hAnsi="Segoe UI" w:cs="Segoe UI"/>
-          <w:sz w:val="16"/>
-          <w:szCs w:val="16"/>
-          <w:shd w:val="clear" w:color="auto" w:fill="FFFFFF"/>
-          <w:lang w:bidi="ar"/>
-        </w:rPr>
-        <w:t> method allows them to give the green light to a funding application, while the </w:t>
-      </w:r>
-      <w:proofErr w:type="spellStart"/>
-      <w:r>
-        <w:rPr>
-          <w:rStyle w:val="HTML"/>
-          <w:rFonts w:ascii="Consolas" w:eastAsia="Consolas" w:hAnsi="Consolas" w:cs="Consolas"/>
-          <w:sz w:val="16"/>
-          <w:szCs w:val="16"/>
-          <w:shd w:val="clear" w:color="auto" w:fill="FFFFFF"/>
-          <w:lang w:bidi="ar"/>
-        </w:rPr>
-        <w:t>rejectApplication</w:t>
-      </w:r>
-      <w:proofErr w:type="spellEnd"/>
-      <w:r>
-        <w:rPr>
-          <w:rStyle w:val="HTML"/>
-          <w:rFonts w:ascii="Consolas" w:eastAsia="Consolas" w:hAnsi="Consolas" w:cs="Consolas"/>
-          <w:sz w:val="16"/>
-          <w:szCs w:val="16"/>
-          <w:shd w:val="clear" w:color="auto" w:fill="FFFFFF"/>
-          <w:lang w:bidi="ar"/>
-        </w:rPr>
-        <w:t>(</w:t>
-      </w:r>
-      <w:proofErr w:type="spellStart"/>
-      <w:r>
-        <w:rPr>
-          <w:rStyle w:val="HTML"/>
-          <w:rFonts w:ascii="Consolas" w:eastAsia="Consolas" w:hAnsi="Consolas" w:cs="Consolas"/>
-          <w:sz w:val="16"/>
-          <w:szCs w:val="16"/>
-          <w:shd w:val="clear" w:color="auto" w:fill="FFFFFF"/>
-          <w:lang w:bidi="ar"/>
-        </w:rPr>
-        <w:t>applicationId</w:t>
-      </w:r>
-      <w:proofErr w:type="spellEnd"/>
-      <w:r>
-        <w:rPr>
-          <w:rStyle w:val="HTML"/>
-          <w:rFonts w:ascii="Consolas" w:eastAsia="Consolas" w:hAnsi="Consolas" w:cs="Consolas"/>
-          <w:sz w:val="16"/>
-          <w:szCs w:val="16"/>
-          <w:shd w:val="clear" w:color="auto" w:fill="FFFFFF"/>
-          <w:lang w:bidi="ar"/>
-        </w:rPr>
-        <w:t>)</w:t>
-      </w:r>
-      <w:r>
-        <w:rPr>
-          <w:rFonts w:ascii="Segoe UI" w:eastAsia="Segoe UI" w:hAnsi="Segoe UI" w:cs="Segoe UI"/>
-          <w:sz w:val="16"/>
-          <w:szCs w:val="16"/>
-          <w:shd w:val="clear" w:color="auto" w:fill="FFFFFF"/>
-          <w:lang w:bidi="ar"/>
-        </w:rPr>
-        <w:t> method enables them to decline an application if it does not meet the necessary criteria. The </w:t>
-      </w:r>
-      <w:proofErr w:type="spellStart"/>
-      <w:r>
-        <w:rPr>
-          <w:rStyle w:val="HTML"/>
-          <w:rFonts w:ascii="Consolas" w:eastAsia="Consolas" w:hAnsi="Consolas" w:cs="Consolas"/>
-          <w:sz w:val="16"/>
-          <w:szCs w:val="16"/>
-          <w:shd w:val="clear" w:color="auto" w:fill="FFFFFF"/>
-          <w:lang w:bidi="ar"/>
-        </w:rPr>
-        <w:t>viewAllApplications</w:t>
-      </w:r>
-      <w:proofErr w:type="spellEnd"/>
-      <w:r>
-        <w:rPr>
-          <w:rFonts w:ascii="Segoe UI" w:eastAsia="Segoe UI" w:hAnsi="Segoe UI" w:cs="Segoe UI"/>
-          <w:sz w:val="16"/>
-          <w:szCs w:val="16"/>
-          <w:shd w:val="clear" w:color="auto" w:fill="FFFFFF"/>
-          <w:lang w:bidi="ar"/>
-        </w:rPr>
-        <w:t> method provides them with an overview of all the funding applications within the system, allowing them to manage and monitor the financial requests from different student clubs.</w:t>
-      </w:r>
-    </w:p>
-    <w:p/>
-    <w:p>
-      <w:pPr>
-        <w:shd w:val="clear" w:color="auto" w:fill="FFFFFF"/>
-        <w:rPr>
-          <w:rFonts w:ascii="Segoe UI" w:eastAsia="Segoe UI" w:hAnsi="Segoe UI" w:cs="Segoe UI"/>
-          <w:sz w:val="16"/>
-          <w:szCs w:val="16"/>
-        </w:rPr>
-      </w:pPr>
-      <w:proofErr w:type="spellStart"/>
-      <w:r>
-        <w:rPr>
-          <w:rStyle w:val="a4"/>
-          <w:rFonts w:ascii="Segoe UI" w:eastAsia="Segoe UI" w:hAnsi="Segoe UI" w:cs="Segoe UI"/>
-          <w:bCs/>
-          <w:sz w:val="16"/>
-          <w:szCs w:val="16"/>
-          <w:shd w:val="clear" w:color="auto" w:fill="FFFFFF"/>
-          <w:lang w:bidi="ar"/>
-        </w:rPr>
-        <w:t>FundingApplication</w:t>
-      </w:r>
-      <w:proofErr w:type="spellEnd"/>
-    </w:p>
-    <w:p/>
-    <w:p>
-      <w:pPr>
-        <w:shd w:val="clear" w:color="auto" w:fill="FFFFFF"/>
-        <w:rPr>
-          <w:rFonts w:ascii="Segoe UI" w:eastAsia="Segoe UI" w:hAnsi="Segoe UI" w:cs="Segoe UI"/>
-          <w:sz w:val="16"/>
-          <w:szCs w:val="16"/>
-        </w:rPr>
-      </w:pPr>
-      <w:r>
-        <w:rPr>
-          <w:rFonts w:ascii="Segoe UI" w:eastAsia="Segoe UI" w:hAnsi="Segoe UI" w:cs="Segoe UI"/>
-          <w:sz w:val="16"/>
-          <w:szCs w:val="16"/>
-          <w:shd w:val="clear" w:color="auto" w:fill="FFFFFF"/>
-          <w:lang w:bidi="ar"/>
-        </w:rPr>
-        <w:t>The </w:t>
-      </w:r>
-      <w:proofErr w:type="spellStart"/>
-      <w:r>
-        <w:rPr>
-          <w:rStyle w:val="HTML"/>
-          <w:rFonts w:ascii="Consolas" w:eastAsia="Consolas" w:hAnsi="Consolas" w:cs="Consolas"/>
-          <w:sz w:val="16"/>
-          <w:szCs w:val="16"/>
-          <w:shd w:val="clear" w:color="auto" w:fill="FFFFFF"/>
-          <w:lang w:bidi="ar"/>
-        </w:rPr>
-        <w:t>FundingApplication</w:t>
-      </w:r>
-      <w:proofErr w:type="spellEnd"/>
-      <w:r>
-        <w:rPr>
-          <w:rFonts w:ascii="Segoe UI" w:eastAsia="Segoe UI" w:hAnsi="Segoe UI" w:cs="Segoe UI"/>
-          <w:sz w:val="16"/>
-          <w:szCs w:val="16"/>
-          <w:shd w:val="clear" w:color="auto" w:fill="FFFFFF"/>
-          <w:lang w:bidi="ar"/>
-        </w:rPr>
-        <w:t> class is central to the financial aspect of the student clubs' activities. It stores important information about each funding application. The </w:t>
-      </w:r>
-      <w:r>
-        <w:rPr>
-          <w:rStyle w:val="HTML"/>
-          <w:rFonts w:ascii="Consolas" w:eastAsia="Consolas" w:hAnsi="Consolas" w:cs="Consolas"/>
-          <w:sz w:val="16"/>
-          <w:szCs w:val="16"/>
-          <w:shd w:val="clear" w:color="auto" w:fill="FFFFFF"/>
-          <w:lang w:bidi="ar"/>
-        </w:rPr>
-        <w:t>id</w:t>
-      </w:r>
-      <w:r>
-        <w:rPr>
-          <w:rFonts w:ascii="Segoe UI" w:eastAsia="Segoe UI" w:hAnsi="Segoe UI" w:cs="Segoe UI"/>
-          <w:sz w:val="16"/>
-          <w:szCs w:val="16"/>
-          <w:shd w:val="clear" w:color="auto" w:fill="FFFFFF"/>
-          <w:lang w:bidi="ar"/>
-        </w:rPr>
-        <w:t> provides a unique identification for each application. The </w:t>
-      </w:r>
-      <w:r>
-        <w:rPr>
-          <w:rStyle w:val="HTML"/>
-          <w:rFonts w:ascii="Consolas" w:eastAsia="Consolas" w:hAnsi="Consolas" w:cs="Consolas"/>
-          <w:sz w:val="16"/>
-          <w:szCs w:val="16"/>
-          <w:shd w:val="clear" w:color="auto" w:fill="FFFFFF"/>
-          <w:lang w:bidi="ar"/>
-        </w:rPr>
-        <w:t>description</w:t>
-      </w:r>
-      <w:r>
-        <w:rPr>
-          <w:rFonts w:ascii="Segoe UI" w:eastAsia="Segoe UI" w:hAnsi="Segoe UI" w:cs="Segoe UI"/>
-          <w:sz w:val="16"/>
-          <w:szCs w:val="16"/>
-          <w:shd w:val="clear" w:color="auto" w:fill="FFFFFF"/>
-          <w:lang w:bidi="ar"/>
-        </w:rPr>
-        <w:t> details how the funds will be used, whether it's for event supplies, guest speakers, or other club-related expenses. The </w:t>
-      </w:r>
-      <w:proofErr w:type="spellStart"/>
-      <w:r>
-        <w:rPr>
-          <w:rStyle w:val="HTML"/>
-          <w:rFonts w:ascii="Consolas" w:eastAsia="Consolas" w:hAnsi="Consolas" w:cs="Consolas"/>
-          <w:sz w:val="16"/>
-          <w:szCs w:val="16"/>
-          <w:shd w:val="clear" w:color="auto" w:fill="FFFFFF"/>
-          <w:lang w:bidi="ar"/>
-        </w:rPr>
-        <w:t>amountRequested</w:t>
-      </w:r>
-      <w:proofErr w:type="spellEnd"/>
-      <w:r>
-        <w:rPr>
-          <w:rFonts w:ascii="Segoe UI" w:eastAsia="Segoe UI" w:hAnsi="Segoe UI" w:cs="Segoe UI"/>
-          <w:sz w:val="16"/>
-          <w:szCs w:val="16"/>
-          <w:shd w:val="clear" w:color="auto" w:fill="FFFFFF"/>
-          <w:lang w:bidi="ar"/>
-        </w:rPr>
-        <w:t> indicates the specific sum of money the student club is seeking to support their activities for the semester. The </w:t>
-      </w:r>
-      <w:r>
-        <w:rPr>
-          <w:rStyle w:val="HTML"/>
-          <w:rFonts w:ascii="Consolas" w:eastAsia="Consolas" w:hAnsi="Consolas" w:cs="Consolas"/>
-          <w:sz w:val="16"/>
-          <w:szCs w:val="16"/>
-          <w:shd w:val="clear" w:color="auto" w:fill="FFFFFF"/>
-          <w:lang w:bidi="ar"/>
-        </w:rPr>
-        <w:t>status</w:t>
-      </w:r>
-      <w:r>
-        <w:rPr>
-          <w:rFonts w:ascii="Segoe UI" w:eastAsia="Segoe UI" w:hAnsi="Segoe UI" w:cs="Segoe UI"/>
-          <w:sz w:val="16"/>
-          <w:szCs w:val="16"/>
-          <w:shd w:val="clear" w:color="auto" w:fill="FFFFFF"/>
-          <w:lang w:bidi="ar"/>
-        </w:rPr>
-        <w:t> reflects the current stage of the application, whether it's in draft, submitted, in review, approved, or rejected.</w:t>
-      </w:r>
-    </w:p>
-    <w:p/>
-    <w:p>
-      <w:pPr>
-        <w:shd w:val="clear" w:color="auto" w:fill="FFFFFF"/>
-        <w:rPr>
-          <w:rFonts w:ascii="Segoe UI" w:eastAsia="Segoe UI" w:hAnsi="Segoe UI" w:cs="Segoe UI"/>
-          <w:sz w:val="16"/>
-          <w:szCs w:val="16"/>
-        </w:rPr>
-      </w:pPr>
-      <w:r>
-        <w:rPr>
-          <w:rFonts w:ascii="Segoe UI" w:eastAsia="Segoe UI" w:hAnsi="Segoe UI" w:cs="Segoe UI"/>
-          <w:sz w:val="16"/>
-          <w:szCs w:val="16"/>
-          <w:shd w:val="clear" w:color="auto" w:fill="FFFFFF"/>
-          <w:lang w:bidi="ar"/>
-        </w:rPr>
-        <w:t>Club administrators can create a new funding application using the </w:t>
-      </w:r>
-      <w:proofErr w:type="spellStart"/>
-      <w:proofErr w:type="gramStart"/>
-      <w:r>
-        <w:rPr>
-          <w:rStyle w:val="HTML"/>
-          <w:rFonts w:ascii="Consolas" w:eastAsia="Consolas" w:hAnsi="Consolas" w:cs="Consolas"/>
-          <w:sz w:val="16"/>
-          <w:szCs w:val="16"/>
-          <w:shd w:val="clear" w:color="auto" w:fill="FFFFFF"/>
-          <w:lang w:bidi="ar"/>
-        </w:rPr>
-        <w:t>createApplication</w:t>
-      </w:r>
-      <w:proofErr w:type="spellEnd"/>
-      <w:r>
-        <w:rPr>
-          <w:rStyle w:val="HTML"/>
-          <w:rFonts w:ascii="Consolas" w:eastAsia="Consolas" w:hAnsi="Consolas" w:cs="Consolas"/>
-          <w:sz w:val="16"/>
-          <w:szCs w:val="16"/>
-          <w:shd w:val="clear" w:color="auto" w:fill="FFFFFF"/>
-          <w:lang w:bidi="ar"/>
-        </w:rPr>
-        <w:t>(</w:t>
-      </w:r>
-      <w:proofErr w:type="gramEnd"/>
-      <w:r>
-        <w:rPr>
-          <w:rStyle w:val="HTML"/>
-          <w:rFonts w:ascii="Consolas" w:eastAsia="Consolas" w:hAnsi="Consolas" w:cs="Consolas"/>
-          <w:sz w:val="16"/>
-          <w:szCs w:val="16"/>
-          <w:shd w:val="clear" w:color="auto" w:fill="FFFFFF"/>
-          <w:lang w:bidi="ar"/>
-        </w:rPr>
-        <w:t xml:space="preserve">description, </w:t>
-      </w:r>
-      <w:proofErr w:type="spellStart"/>
-      <w:r>
-        <w:rPr>
-          <w:rStyle w:val="HTML"/>
-          <w:rFonts w:ascii="Consolas" w:eastAsia="Consolas" w:hAnsi="Consolas" w:cs="Consolas"/>
-          <w:sz w:val="16"/>
-          <w:szCs w:val="16"/>
-          <w:shd w:val="clear" w:color="auto" w:fill="FFFFFF"/>
-          <w:lang w:bidi="ar"/>
-        </w:rPr>
-        <w:t>amountRequested</w:t>
-      </w:r>
-      <w:proofErr w:type="spellEnd"/>
-      <w:r>
-        <w:rPr>
-          <w:rStyle w:val="HTML"/>
-          <w:rFonts w:ascii="Consolas" w:eastAsia="Consolas" w:hAnsi="Consolas" w:cs="Consolas"/>
-          <w:sz w:val="16"/>
-          <w:szCs w:val="16"/>
-          <w:shd w:val="clear" w:color="auto" w:fill="FFFFFF"/>
-          <w:lang w:bidi="ar"/>
-        </w:rPr>
-        <w:t>)</w:t>
-      </w:r>
-      <w:r>
-        <w:rPr>
-          <w:rFonts w:ascii="Segoe UI" w:eastAsia="Segoe UI" w:hAnsi="Segoe UI" w:cs="Segoe UI"/>
-          <w:sz w:val="16"/>
-          <w:szCs w:val="16"/>
-          <w:shd w:val="clear" w:color="auto" w:fill="FFFFFF"/>
-          <w:lang w:bidi="ar"/>
-        </w:rPr>
-        <w:t> method. If there are changes needed, they can use the </w:t>
-      </w:r>
-      <w:proofErr w:type="spellStart"/>
-      <w:proofErr w:type="gramStart"/>
-      <w:r>
-        <w:rPr>
-          <w:rStyle w:val="HTML"/>
-          <w:rFonts w:ascii="Consolas" w:eastAsia="Consolas" w:hAnsi="Consolas" w:cs="Consolas"/>
-          <w:sz w:val="16"/>
-          <w:szCs w:val="16"/>
-          <w:shd w:val="clear" w:color="auto" w:fill="FFFFFF"/>
-          <w:lang w:bidi="ar"/>
-        </w:rPr>
-        <w:t>editApplication</w:t>
-      </w:r>
-      <w:proofErr w:type="spellEnd"/>
-      <w:r>
-        <w:rPr>
-          <w:rStyle w:val="HTML"/>
-          <w:rFonts w:ascii="Consolas" w:eastAsia="Consolas" w:hAnsi="Consolas" w:cs="Consolas"/>
-          <w:sz w:val="16"/>
-          <w:szCs w:val="16"/>
-          <w:shd w:val="clear" w:color="auto" w:fill="FFFFFF"/>
-          <w:lang w:bidi="ar"/>
-        </w:rPr>
-        <w:t>(</w:t>
-      </w:r>
-      <w:proofErr w:type="spellStart"/>
-      <w:proofErr w:type="gramEnd"/>
-      <w:r>
-        <w:rPr>
-          <w:rStyle w:val="HTML"/>
-          <w:rFonts w:ascii="Consolas" w:eastAsia="Consolas" w:hAnsi="Consolas" w:cs="Consolas"/>
-          <w:sz w:val="16"/>
-          <w:szCs w:val="16"/>
-          <w:shd w:val="clear" w:color="auto" w:fill="FFFFFF"/>
-          <w:lang w:bidi="ar"/>
-        </w:rPr>
-        <w:t>applicationId</w:t>
-      </w:r>
-      <w:proofErr w:type="spellEnd"/>
-      <w:r>
-        <w:rPr>
-          <w:rStyle w:val="HTML"/>
-          <w:rFonts w:ascii="Consolas" w:eastAsia="Consolas" w:hAnsi="Consolas" w:cs="Consolas"/>
-          <w:sz w:val="16"/>
-          <w:szCs w:val="16"/>
-          <w:shd w:val="clear" w:color="auto" w:fill="FFFFFF"/>
-          <w:lang w:bidi="ar"/>
-        </w:rPr>
-        <w:t xml:space="preserve">, </w:t>
-      </w:r>
-      <w:proofErr w:type="spellStart"/>
-      <w:r>
-        <w:rPr>
-          <w:rStyle w:val="HTML"/>
-          <w:rFonts w:ascii="Consolas" w:eastAsia="Consolas" w:hAnsi="Consolas" w:cs="Consolas"/>
-          <w:sz w:val="16"/>
-          <w:szCs w:val="16"/>
-          <w:shd w:val="clear" w:color="auto" w:fill="FFFFFF"/>
-          <w:lang w:bidi="ar"/>
-        </w:rPr>
-        <w:t>newDetails</w:t>
-      </w:r>
-      <w:proofErr w:type="spellEnd"/>
-      <w:r>
-        <w:rPr>
-          <w:rStyle w:val="HTML"/>
-          <w:rFonts w:ascii="Consolas" w:eastAsia="Consolas" w:hAnsi="Consolas" w:cs="Consolas"/>
-          <w:sz w:val="16"/>
-          <w:szCs w:val="16"/>
-          <w:shd w:val="clear" w:color="auto" w:fill="FFFFFF"/>
-          <w:lang w:bidi="ar"/>
-        </w:rPr>
-        <w:t>)</w:t>
-      </w:r>
-      <w:r>
-        <w:rPr>
-          <w:rFonts w:ascii="Segoe UI" w:eastAsia="Segoe UI" w:hAnsi="Segoe UI" w:cs="Segoe UI"/>
-          <w:sz w:val="16"/>
-          <w:szCs w:val="16"/>
-          <w:shd w:val="clear" w:color="auto" w:fill="FFFFFF"/>
-          <w:lang w:bidi="ar"/>
-        </w:rPr>
-        <w:t> method to update the application. In case they decide to withdraw the application, the </w:t>
-      </w:r>
-      <w:proofErr w:type="spellStart"/>
-      <w:r>
-        <w:rPr>
-          <w:rStyle w:val="HTML"/>
-          <w:rFonts w:ascii="Consolas" w:eastAsia="Consolas" w:hAnsi="Consolas" w:cs="Consolas"/>
-          <w:sz w:val="16"/>
-          <w:szCs w:val="16"/>
-          <w:shd w:val="clear" w:color="auto" w:fill="FFFFFF"/>
-          <w:lang w:bidi="ar"/>
-        </w:rPr>
-        <w:t>cancelApplication</w:t>
-      </w:r>
-      <w:proofErr w:type="spellEnd"/>
-      <w:r>
-        <w:rPr>
-          <w:rStyle w:val="HTML"/>
-          <w:rFonts w:ascii="Consolas" w:eastAsia="Consolas" w:hAnsi="Consolas" w:cs="Consolas"/>
-          <w:sz w:val="16"/>
-          <w:szCs w:val="16"/>
-          <w:shd w:val="clear" w:color="auto" w:fill="FFFFFF"/>
-          <w:lang w:bidi="ar"/>
-        </w:rPr>
-        <w:t>(</w:t>
-      </w:r>
-      <w:proofErr w:type="spellStart"/>
-      <w:r>
-        <w:rPr>
-          <w:rStyle w:val="HTML"/>
-          <w:rFonts w:ascii="Consolas" w:eastAsia="Consolas" w:hAnsi="Consolas" w:cs="Consolas"/>
-          <w:sz w:val="16"/>
-          <w:szCs w:val="16"/>
-          <w:shd w:val="clear" w:color="auto" w:fill="FFFFFF"/>
-          <w:lang w:bidi="ar"/>
-        </w:rPr>
-        <w:t>applicationId</w:t>
-      </w:r>
-      <w:proofErr w:type="spellEnd"/>
-      <w:r>
-        <w:rPr>
-          <w:rStyle w:val="HTML"/>
-          <w:rFonts w:ascii="Consolas" w:eastAsia="Consolas" w:hAnsi="Consolas" w:cs="Consolas"/>
-          <w:sz w:val="16"/>
-          <w:szCs w:val="16"/>
-          <w:shd w:val="clear" w:color="auto" w:fill="FFFFFF"/>
-          <w:lang w:bidi="ar"/>
-        </w:rPr>
-        <w:t>)</w:t>
-      </w:r>
-      <w:r>
-        <w:rPr>
-          <w:rFonts w:ascii="Segoe UI" w:eastAsia="Segoe UI" w:hAnsi="Segoe UI" w:cs="Segoe UI"/>
-          <w:sz w:val="16"/>
-          <w:szCs w:val="16"/>
-          <w:shd w:val="clear" w:color="auto" w:fill="FFFFFF"/>
-          <w:lang w:bidi="ar"/>
-        </w:rPr>
         <w:t> method can be used, but only if the application has not already been approved or rejected. The </w:t>
       </w:r>
       <w:proofErr w:type="spellStart"/>
@@ -2383,29 +2375,7 @@
           <w:shd w:val="clear" w:color="auto" w:fill="FFFFFF"/>
           <w:lang w:bidi="ar"/>
         </w:rPr>
-        <w:t xml:space="preserve"> method allows club administrators to check the </w:t>
-      </w:r>
-      <w:proofErr w:type="gramStart"/>
-      <w:r>
-        <w:rPr>
-          <w:rFonts w:ascii="Segoe UI" w:eastAsia="Segoe UI" w:hAnsi="Segoe UI" w:cs="Segoe UI"/>
-          <w:sz w:val="16"/>
-          <w:szCs w:val="16"/>
-          <w:shd w:val="clear" w:color="auto" w:fill="FFFFFF"/>
-          <w:lang w:bidi="ar"/>
-        </w:rPr>
-        <w:t>current status</w:t>
-      </w:r>
-      <w:proofErr w:type="gramEnd"/>
-      <w:r>
-        <w:rPr>
-          <w:rFonts w:ascii="Segoe UI" w:eastAsia="Segoe UI" w:hAnsi="Segoe UI" w:cs="Segoe UI"/>
-          <w:sz w:val="16"/>
-          <w:szCs w:val="16"/>
-          <w:shd w:val="clear" w:color="auto" w:fill="FFFFFF"/>
-          <w:lang w:bidi="ar"/>
-        </w:rPr>
-        <w:t xml:space="preserve"> of their funding application, providing them with clarity on where the application stands in the review process.</w:t>
+        <w:t> method allows club administrators to check the current status of their funding application, providing them with clarity on where the application stands in the review process.</w:t>
       </w:r>
     </w:p>
     <w:p/>
@@ -2862,29 +2832,7 @@
           <w:shd w:val="clear" w:color="auto" w:fill="FFFFFF"/>
           <w:lang w:bidi="ar"/>
         </w:rPr>
-        <w:t xml:space="preserve"> method is used. This method also </w:t>
-      </w:r>
-      <w:proofErr w:type="gramStart"/>
-      <w:r>
-        <w:rPr>
-          <w:rFonts w:ascii="Segoe UI" w:eastAsia="Segoe UI" w:hAnsi="Segoe UI" w:cs="Segoe UI"/>
-          <w:sz w:val="16"/>
-          <w:szCs w:val="16"/>
-          <w:shd w:val="clear" w:color="auto" w:fill="FFFFFF"/>
-          <w:lang w:bidi="ar"/>
-        </w:rPr>
-        <w:t>takes into account</w:t>
-      </w:r>
-      <w:proofErr w:type="gramEnd"/>
-      <w:r>
-        <w:rPr>
-          <w:rFonts w:ascii="Segoe UI" w:eastAsia="Segoe UI" w:hAnsi="Segoe UI" w:cs="Segoe UI"/>
-          <w:sz w:val="16"/>
-          <w:szCs w:val="16"/>
-          <w:shd w:val="clear" w:color="auto" w:fill="FFFFFF"/>
-          <w:lang w:bidi="ar"/>
-        </w:rPr>
-        <w:t xml:space="preserve"> the RSVPs and may need to handle refund or notification processes depending on the nature of the event.</w:t>
+        <w:t> method is used. This method also takes into account the RSVPs and may need to handle refund or notification processes depending on the nature of the event.</w:t>
       </w:r>
     </w:p>
     <w:p/>
@@ -3012,29 +2960,7 @@
           <w:shd w:val="clear" w:color="auto" w:fill="FFFFFF"/>
           <w:lang w:bidi="ar"/>
         </w:rPr>
-        <w:t xml:space="preserve"> indicates whether the RSVP is confirmed, pending, or cancelled. Each event can have multiple RSVPs, and each student can submit an RSVP for an event they are interested in. However, each attendee must already exist in the system, and a student can have only one RSVP for a particular event. This ensures that the RSVP process is organized and accurate, preventing overbooking or confusion. If a student RSVPs for multiple people, they can manage and cancel some or </w:t>
-      </w:r>
-      <w:proofErr w:type="gramStart"/>
-      <w:r>
-        <w:rPr>
-          <w:rFonts w:ascii="Segoe UI" w:eastAsia="Segoe UI" w:hAnsi="Segoe UI" w:cs="Segoe UI"/>
-          <w:sz w:val="16"/>
-          <w:szCs w:val="16"/>
-          <w:shd w:val="clear" w:color="auto" w:fill="FFFFFF"/>
-          <w:lang w:bidi="ar"/>
-        </w:rPr>
-        <w:t>all of</w:t>
-      </w:r>
-      <w:proofErr w:type="gramEnd"/>
-      <w:r>
-        <w:rPr>
-          <w:rFonts w:ascii="Segoe UI" w:eastAsia="Segoe UI" w:hAnsi="Segoe UI" w:cs="Segoe UI"/>
-          <w:sz w:val="16"/>
-          <w:szCs w:val="16"/>
-          <w:shd w:val="clear" w:color="auto" w:fill="FFFFFF"/>
-          <w:lang w:bidi="ar"/>
-        </w:rPr>
-        <w:t xml:space="preserve"> the RSVPs as needed, up until the event date and time. The system must then update the event's available capacity accordingly.</w:t>
+        <w:t> indicates whether the RSVP is confirmed, pending, or cancelled. Each event can have multiple RSVPs, and each student can submit an RSVP for an event they are interested in. However, each attendee must already exist in the system, and a student can have only one RSVP for a particular event. This ensures that the RSVP process is organized and accurate, preventing overbooking or confusion. If a student RSVPs for multiple people, they can manage and cancel some or all of the RSVPs as needed, up until the event date and time. The system must then update the event's available capacity accordingly.</w:t>
       </w:r>
     </w:p>
     <w:p>
@@ -3057,7 +2983,7 @@
 </file>
 
 <file path=word/styles.xml><?xml version="1.0" encoding="utf-8"?>
-<w:styles xmlns:mc="http://schemas.openxmlformats.org/markup-compatibility/2006" xmlns:r="http://schemas.openxmlformats.org/officeDocument/2006/relationships" xmlns:w="http://schemas.openxmlformats.org/wordprocessingml/2006/main" xmlns:w14="http://schemas.microsoft.com/office/word/2010/wordml" xmlns:w15="http://schemas.microsoft.com/office/word/2012/wordml" xmlns:w16cex="http://schemas.microsoft.com/office/word/2018/wordml/cex" xmlns:w16cid="http://schemas.microsoft.com/office/word/2016/wordml/cid" xmlns:w16="http://schemas.microsoft.com/office/word/2018/wordml" xmlns:w16sdtdh="http://schemas.microsoft.com/office/word/2020/wordml/sdtdatahash" xmlns:w16se="http://schemas.microsoft.com/office/word/2015/wordml/symex" mc:Ignorable="w14 w15 w16se w16cid w16 w16cex w16sdtdh">
+<w:styles xmlns:mc="http://schemas.openxmlformats.org/markup-compatibility/2006" xmlns:r="http://schemas.openxmlformats.org/officeDocument/2006/relationships" xmlns:w="http://schemas.openxmlformats.org/wordprocessingml/2006/main" xmlns:w14="http://schemas.microsoft.com/office/word/2010/wordml" xmlns:w15="http://schemas.microsoft.com/office/word/2012/wordml" xmlns:w16cex="http://schemas.microsoft.com/office/word/2018/wordml/cex" xmlns:w16cid="http://schemas.microsoft.com/office/word/2016/wordml/cid" xmlns:w16="http://schemas.microsoft.com/office/word/2018/wordml" xmlns:w16du="http://schemas.microsoft.com/office/word/2023/wordml/word16du" xmlns:w16sdtdh="http://schemas.microsoft.com/office/word/2020/wordml/sdtdatahash" xmlns:w16se="http://schemas.microsoft.com/office/word/2015/wordml/symex" mc:Ignorable="w14 w15 w16se w16cid w16 w16cex w16sdtdh w16du">
   <w:docDefaults>
     <w:rPrDefault>
       <w:rPr>

</xml_diff>